<commit_message>
Informe de actividades jun-jul
</commit_message>
<xml_diff>
--- a/1023630560, SAMUEL LÓPEZ IA.docx
+++ b/1023630560, SAMUEL LÓPEZ IA.docx
@@ -1,14 +1,14 @@
 
 <file path=word/document.xml><?xml version="1.0" encoding="utf-8"?>
-<w:document xmlns:wpc="http://schemas.microsoft.com/office/word/2010/wordprocessingCanvas" xmlns:cx="http://schemas.microsoft.com/office/drawing/2014/chartex" xmlns:cx1="http://schemas.microsoft.com/office/drawing/2015/9/8/chartex" xmlns:cx2="http://schemas.microsoft.com/office/drawing/2015/10/21/chartex" xmlns:cx3="http://schemas.microsoft.com/office/drawing/2016/5/9/chartex" xmlns:cx4="http://schemas.microsoft.com/office/drawing/2016/5/10/chartex" xmlns:cx5="http://schemas.microsoft.com/office/drawing/2016/5/11/chartex" xmlns:cx6="http://schemas.microsoft.com/office/drawing/2016/5/12/chartex" xmlns:cx7="http://schemas.microsoft.com/office/drawing/2016/5/13/chartex" xmlns:cx8="http://schemas.microsoft.com/office/drawing/2016/5/14/chartex" xmlns:mc="http://schemas.openxmlformats.org/markup-compatibility/2006" xmlns:aink="http://schemas.microsoft.com/office/drawing/2016/ink" xmlns:am3d="http://schemas.microsoft.com/office/drawing/2017/model3d" xmlns:o="urn:schemas-microsoft-com:office:office" xmlns:oel="http://schemas.microsoft.com/office/2019/extlst" xmlns:r="http://schemas.openxmlformats.org/officeDocument/2006/relationships" xmlns:m="http://schemas.openxmlformats.org/officeDocument/2006/math" xmlns:v="urn:schemas-microsoft-com:vml" xmlns:wp14="http://schemas.microsoft.com/office/word/2010/wordprocessingDrawing" xmlns:wp="http://schemas.openxmlformats.org/drawingml/2006/wordprocessingDrawing" xmlns:w10="urn:schemas-microsoft-com:office:word" xmlns:w="http://schemas.openxmlformats.org/wordprocessingml/2006/main" xmlns:w14="http://schemas.microsoft.com/office/word/2010/wordml" xmlns:w15="http://schemas.microsoft.com/office/word/2012/wordml" xmlns:w16cex="http://schemas.microsoft.com/office/word/2018/wordml/cex" xmlns:w16cid="http://schemas.microsoft.com/office/word/2016/wordml/cid" xmlns:w16="http://schemas.microsoft.com/office/word/2018/wordml" xmlns:w16du="http://schemas.microsoft.com/office/word/2023/wordml/word16du" xmlns:w16sdtdh="http://schemas.microsoft.com/office/word/2020/wordml/sdtdatahash" xmlns:w16sdtfl="http://schemas.microsoft.com/office/word/2024/wordml/sdtformatlock" xmlns:w16se="http://schemas.microsoft.com/office/word/2015/wordml/symex" xmlns:wpg="http://schemas.microsoft.com/office/word/2010/wordprocessingGroup" xmlns:wpi="http://schemas.microsoft.com/office/word/2010/wordprocessingInk" xmlns:wne="http://schemas.microsoft.com/office/word/2006/wordml" xmlns:wps="http://schemas.microsoft.com/office/word/2010/wordprocessingShape" xmlns:a="http://schemas.openxmlformats.org/drawingml/2006/main" xmlns:pic="http://schemas.openxmlformats.org/drawingml/2006/picture" xmlns:a14="http://schemas.microsoft.com/office/drawing/2010/main" mc:Ignorable="w14 w15 w16se w16cid w16 w16cex w16sdtdh w16sdtfl w16du wp14">
+<w:document xmlns:wpc="http://schemas.microsoft.com/office/word/2010/wordprocessingCanvas" xmlns:cx="http://schemas.microsoft.com/office/drawing/2014/chartex" xmlns:cx1="http://schemas.microsoft.com/office/drawing/2015/9/8/chartex" xmlns:cx2="http://schemas.microsoft.com/office/drawing/2015/10/21/chartex" xmlns:cx3="http://schemas.microsoft.com/office/drawing/2016/5/9/chartex" xmlns:cx4="http://schemas.microsoft.com/office/drawing/2016/5/10/chartex" xmlns:cx5="http://schemas.microsoft.com/office/drawing/2016/5/11/chartex" xmlns:cx6="http://schemas.microsoft.com/office/drawing/2016/5/12/chartex" xmlns:cx7="http://schemas.microsoft.com/office/drawing/2016/5/13/chartex" xmlns:cx8="http://schemas.microsoft.com/office/drawing/2016/5/14/chartex" xmlns:mc="http://schemas.openxmlformats.org/markup-compatibility/2006" xmlns:aink="http://schemas.microsoft.com/office/drawing/2016/ink" xmlns:am3d="http://schemas.microsoft.com/office/drawing/2017/model3d" xmlns:o="urn:schemas-microsoft-com:office:office" xmlns:oel="http://schemas.microsoft.com/office/2019/extlst" xmlns:r="http://schemas.openxmlformats.org/officeDocument/2006/relationships" xmlns:m="http://schemas.openxmlformats.org/officeDocument/2006/math" xmlns:v="urn:schemas-microsoft-com:vml" xmlns:wp14="http://schemas.microsoft.com/office/word/2010/wordprocessingDrawing" xmlns:wp="http://schemas.openxmlformats.org/drawingml/2006/wordprocessingDrawing" xmlns:w10="urn:schemas-microsoft-com:office:word" xmlns:w="http://schemas.openxmlformats.org/wordprocessingml/2006/main" xmlns:w14="http://schemas.microsoft.com/office/word/2010/wordml" xmlns:w15="http://schemas.microsoft.com/office/word/2012/wordml" xmlns:w16cex="http://schemas.microsoft.com/office/word/2018/wordml/cex" xmlns:w16cid="http://schemas.microsoft.com/office/word/2016/wordml/cid" xmlns:w16="http://schemas.microsoft.com/office/word/2018/wordml" xmlns:w16du="http://schemas.microsoft.com/office/word/2023/wordml/word16du" xmlns:w16sdtdh="http://schemas.microsoft.com/office/word/2020/wordml/sdtdatahash" xmlns:w16sdtfl="http://schemas.microsoft.com/office/word/2024/wordml/sdtformatlock" xmlns:w16se="http://schemas.microsoft.com/office/word/2015/wordml/symex" xmlns:wpg="http://schemas.microsoft.com/office/word/2010/wordprocessingGroup" xmlns:wpi="http://schemas.microsoft.com/office/word/2010/wordprocessingInk" xmlns:wne="http://schemas.microsoft.com/office/word/2006/wordml" xmlns:wps="http://schemas.microsoft.com/office/word/2010/wordprocessingShape" mc:Ignorable="w14 w15 w16se w16cid w16 w16cex w16sdtdh w16sdtfl w16du wp14">
   <w:body>
     <w:tbl>
       <w:tblPr>
         <w:tblW w:w="10343" w:type="dxa"/>
         <w:jc w:val="center"/>
         <w:tblBorders>
-          <w:insideH w:val="single" w:color="auto" w:sz="4" w:space="0"/>
-          <w:insideV w:val="single" w:color="auto" w:sz="4" w:space="0"/>
+          <w:insideH w:val="single" w:sz="4" w:space="0" w:color="auto"/>
+          <w:insideV w:val="single" w:sz="4" w:space="0" w:color="auto"/>
         </w:tblBorders>
         <w:tblLayout w:type="fixed"/>
         <w:tblCellMar>
@@ -30,13 +30,12 @@
           <w:tcPr>
             <w:tcW w:w="10343" w:type="dxa"/>
             <w:tcBorders>
-              <w:top w:val="single" w:color="auto" w:sz="4" w:space="0"/>
-              <w:left w:val="single" w:color="auto" w:sz="4" w:space="0"/>
-              <w:bottom w:val="single" w:color="auto" w:sz="4" w:space="0"/>
-              <w:right w:val="single" w:color="auto" w:sz="4" w:space="0"/>
+              <w:top w:val="single" w:sz="4" w:space="0" w:color="auto"/>
+              <w:left w:val="single" w:sz="4" w:space="0" w:color="auto"/>
+              <w:bottom w:val="single" w:sz="4" w:space="0" w:color="auto"/>
+              <w:right w:val="single" w:sz="4" w:space="0" w:color="auto"/>
             </w:tcBorders>
             <w:shd w:val="clear" w:color="auto" w:fill="BFBFBF" w:themeFill="background1" w:themeFillShade="BF"/>
-            <w:tcMar/>
             <w:vAlign w:val="center"/>
           </w:tcPr>
           <w:p>
@@ -45,9 +44,9 @@
               <w:ind w:left="720"/>
               <w:jc w:val="center"/>
               <w:rPr>
-                <w:rFonts w:ascii="Calibri" w:hAnsi="Calibri" w:eastAsia="MS Mincho" w:cs="Calibri" w:asciiTheme="minorAscii" w:hAnsiTheme="minorAscii" w:cstheme="minorAscii"/>
-                <w:b w:val="1"/>
-                <w:bCs w:val="1"/>
+                <w:rFonts w:asciiTheme="minorHAnsi" w:eastAsia="MS Mincho" w:hAnsiTheme="minorHAnsi" w:cstheme="minorBidi"/>
+                <w:b/>
+                <w:bCs/>
                 <w:sz w:val="20"/>
                 <w:szCs w:val="20"/>
                 <w:lang w:eastAsia="es-ES"/>
@@ -55,9 +54,9 @@
             </w:pPr>
             <w:r>
               <w:rPr>
-                <w:rFonts w:ascii="Calibri" w:hAnsi="Calibri" w:eastAsia="MS Mincho" w:cs="Calibri" w:asciiTheme="minorAscii" w:hAnsiTheme="minorAscii" w:cstheme="minorAscii"/>
-                <w:b w:val="1"/>
-                <w:bCs w:val="1"/>
+                <w:rFonts w:asciiTheme="minorHAnsi" w:eastAsia="MS Mincho" w:hAnsiTheme="minorHAnsi" w:cstheme="minorBidi"/>
+                <w:b/>
+                <w:bCs/>
                 <w:sz w:val="20"/>
                 <w:szCs w:val="20"/>
                 <w:lang w:eastAsia="es-ES"/>
@@ -66,9 +65,9 @@
             </w:r>
             <w:r>
               <w:rPr>
-                <w:rFonts w:ascii="Calibri" w:hAnsi="Calibri" w:eastAsia="MS Mincho" w:cs="Calibri" w:asciiTheme="minorAscii" w:hAnsiTheme="minorAscii" w:cstheme="minorAscii"/>
-                <w:b w:val="1"/>
-                <w:bCs w:val="1"/>
+                <w:rFonts w:asciiTheme="minorHAnsi" w:eastAsia="MS Mincho" w:hAnsiTheme="minorHAnsi" w:cstheme="minorBidi"/>
+                <w:b/>
+                <w:bCs/>
                 <w:sz w:val="20"/>
                 <w:szCs w:val="20"/>
                 <w:lang w:eastAsia="es-ES"/>
@@ -94,12 +93,12 @@
         <w:tblW w:w="10343" w:type="dxa"/>
         <w:jc w:val="center"/>
         <w:tblBorders>
-          <w:top w:val="single" w:color="auto" w:sz="4" w:space="0"/>
-          <w:left w:val="single" w:color="auto" w:sz="4" w:space="0"/>
-          <w:bottom w:val="single" w:color="auto" w:sz="4" w:space="0"/>
-          <w:right w:val="single" w:color="auto" w:sz="4" w:space="0"/>
-          <w:insideH w:val="single" w:color="auto" w:sz="4" w:space="0"/>
-          <w:insideV w:val="single" w:color="auto" w:sz="4" w:space="0"/>
+          <w:top w:val="single" w:sz="4" w:space="0" w:color="auto"/>
+          <w:left w:val="single" w:sz="4" w:space="0" w:color="auto"/>
+          <w:bottom w:val="single" w:sz="4" w:space="0" w:color="auto"/>
+          <w:right w:val="single" w:sz="4" w:space="0" w:color="auto"/>
+          <w:insideH w:val="single" w:sz="4" w:space="0" w:color="auto"/>
+          <w:insideV w:val="single" w:sz="4" w:space="0" w:color="auto"/>
         </w:tblBorders>
         <w:tblLayout w:type="fixed"/>
         <w:tblCellMar>
@@ -123,7 +122,6 @@
             <w:tcW w:w="10343" w:type="dxa"/>
             <w:gridSpan w:val="2"/>
             <w:shd w:val="clear" w:color="auto" w:fill="BFBFBF" w:themeFill="background1" w:themeFillShade="BF"/>
-            <w:tcMar/>
             <w:vAlign w:val="center"/>
           </w:tcPr>
           <w:p>
@@ -133,7 +131,7 @@
               <w:jc w:val="center"/>
               <w:outlineLvl w:val="0"/>
               <w:rPr>
-                <w:rFonts w:eastAsia="MS Mincho" w:asciiTheme="minorHAnsi" w:hAnsiTheme="minorHAnsi" w:cstheme="minorHAnsi"/>
+                <w:rFonts w:asciiTheme="minorHAnsi" w:eastAsia="MS Mincho" w:hAnsiTheme="minorHAnsi" w:cstheme="minorHAnsi"/>
                 <w:b/>
                 <w:bCs/>
                 <w:sz w:val="20"/>
@@ -141,10 +139,10 @@
                 <w:lang w:eastAsia="es-ES"/>
               </w:rPr>
             </w:pPr>
-            <w:bookmarkStart w:name="_Hlk64358364" w:id="0"/>
-            <w:r>
-              <w:rPr>
-                <w:rFonts w:eastAsia="MS Mincho" w:asciiTheme="minorHAnsi" w:hAnsiTheme="minorHAnsi" w:cstheme="minorHAnsi"/>
+            <w:bookmarkStart w:id="0" w:name="_Hlk64358364"/>
+            <w:r>
+              <w:rPr>
+                <w:rFonts w:asciiTheme="minorHAnsi" w:eastAsia="MS Mincho" w:hAnsiTheme="minorHAnsi" w:cstheme="minorHAnsi"/>
                 <w:b/>
                 <w:sz w:val="20"/>
                 <w:szCs w:val="20"/>
@@ -164,7 +162,6 @@
         <w:tc>
           <w:tcPr>
             <w:tcW w:w="2547" w:type="dxa"/>
-            <w:tcMar/>
             <w:vAlign w:val="center"/>
           </w:tcPr>
           <w:p>
@@ -175,7 +172,7 @@
               </w:numPr>
               <w:spacing w:after="0"/>
               <w:rPr>
-                <w:rFonts w:eastAsia="MS Mincho" w:asciiTheme="minorHAnsi" w:hAnsiTheme="minorHAnsi" w:cstheme="minorHAnsi"/>
+                <w:rFonts w:asciiTheme="minorHAnsi" w:eastAsia="MS Mincho" w:hAnsiTheme="minorHAnsi" w:cstheme="minorHAnsi"/>
                 <w:b/>
                 <w:sz w:val="20"/>
                 <w:szCs w:val="20"/>
@@ -184,7 +181,7 @@
             </w:pPr>
             <w:r>
               <w:rPr>
-                <w:rFonts w:eastAsia="MS Mincho" w:asciiTheme="minorHAnsi" w:hAnsiTheme="minorHAnsi" w:cstheme="minorHAnsi"/>
+                <w:rFonts w:asciiTheme="minorHAnsi" w:eastAsia="MS Mincho" w:hAnsiTheme="minorHAnsi" w:cstheme="minorHAnsi"/>
                 <w:b/>
                 <w:sz w:val="20"/>
                 <w:szCs w:val="20"/>
@@ -197,7 +194,6 @@
         <w:tc>
           <w:tcPr>
             <w:tcW w:w="7796" w:type="dxa"/>
-            <w:tcMar/>
             <w:vAlign w:val="center"/>
           </w:tcPr>
           <w:p>
@@ -206,7 +202,7 @@
             </w:pPr>
             <w:r>
               <w:rPr>
-                <w:rFonts w:ascii="Calibri" w:hAnsi="Calibri" w:eastAsia="MS Mincho" w:cs="Calibri" w:asciiTheme="minorAscii" w:hAnsiTheme="minorAscii" w:cstheme="minorAscii"/>
+                <w:rFonts w:asciiTheme="minorHAnsi" w:eastAsia="MS Mincho" w:hAnsiTheme="minorHAnsi" w:cstheme="minorBidi"/>
                 <w:sz w:val="20"/>
                 <w:szCs w:val="20"/>
                 <w:lang w:eastAsia="es-ES"/>
@@ -225,7 +221,6 @@
         <w:tc>
           <w:tcPr>
             <w:tcW w:w="2547" w:type="dxa"/>
-            <w:tcMar/>
             <w:vAlign w:val="center"/>
           </w:tcPr>
           <w:p>
@@ -236,7 +231,7 @@
               </w:numPr>
               <w:spacing w:after="0"/>
               <w:rPr>
-                <w:rFonts w:eastAsia="MS Mincho" w:asciiTheme="minorHAnsi" w:hAnsiTheme="minorHAnsi" w:cstheme="minorHAnsi"/>
+                <w:rFonts w:asciiTheme="minorHAnsi" w:eastAsia="MS Mincho" w:hAnsiTheme="minorHAnsi" w:cstheme="minorHAnsi"/>
                 <w:b/>
                 <w:sz w:val="20"/>
                 <w:szCs w:val="20"/>
@@ -245,7 +240,7 @@
             </w:pPr>
             <w:r>
               <w:rPr>
-                <w:rFonts w:eastAsia="MS Mincho" w:asciiTheme="minorHAnsi" w:hAnsiTheme="minorHAnsi" w:cstheme="minorHAnsi"/>
+                <w:rFonts w:asciiTheme="minorHAnsi" w:eastAsia="MS Mincho" w:hAnsiTheme="minorHAnsi" w:cstheme="minorHAnsi"/>
                 <w:b/>
                 <w:sz w:val="20"/>
                 <w:szCs w:val="20"/>
@@ -258,16 +253,15 @@
         <w:tc>
           <w:tcPr>
             <w:tcW w:w="7796" w:type="dxa"/>
-            <w:tcMar/>
             <w:vAlign w:val="center"/>
           </w:tcPr>
           <w:p>
             <w:pPr>
-              <w:spacing w:before="0" w:beforeAutospacing="off" w:after="0" w:afterAutospacing="off" w:line="276" w:lineRule="auto"/>
+              <w:spacing w:after="0"/>
             </w:pPr>
             <w:r>
               <w:rPr>
-                <w:rFonts w:ascii="Calibri" w:hAnsi="Calibri" w:eastAsia="Calibri" w:cs="Calibri"/>
+                <w:rFonts w:cs="Calibri"/>
                 <w:sz w:val="20"/>
                 <w:szCs w:val="20"/>
               </w:rPr>
@@ -285,7 +279,6 @@
         <w:tc>
           <w:tcPr>
             <w:tcW w:w="2547" w:type="dxa"/>
-            <w:tcMar/>
             <w:vAlign w:val="center"/>
           </w:tcPr>
           <w:p>
@@ -296,7 +289,7 @@
               </w:numPr>
               <w:spacing w:after="0"/>
               <w:rPr>
-                <w:rFonts w:eastAsia="MS Mincho" w:asciiTheme="minorHAnsi" w:hAnsiTheme="minorHAnsi" w:cstheme="minorHAnsi"/>
+                <w:rFonts w:asciiTheme="minorHAnsi" w:eastAsia="MS Mincho" w:hAnsiTheme="minorHAnsi" w:cstheme="minorHAnsi"/>
                 <w:b/>
                 <w:sz w:val="20"/>
                 <w:szCs w:val="20"/>
@@ -305,7 +298,7 @@
             </w:pPr>
             <w:r>
               <w:rPr>
-                <w:rFonts w:eastAsia="MS Mincho" w:asciiTheme="minorHAnsi" w:hAnsiTheme="minorHAnsi" w:cstheme="minorHAnsi"/>
+                <w:rFonts w:asciiTheme="minorHAnsi" w:eastAsia="MS Mincho" w:hAnsiTheme="minorHAnsi" w:cstheme="minorHAnsi"/>
                 <w:b/>
                 <w:sz w:val="20"/>
                 <w:szCs w:val="20"/>
@@ -318,7 +311,6 @@
         <w:tc>
           <w:tcPr>
             <w:tcW w:w="7796" w:type="dxa"/>
-            <w:tcMar/>
             <w:vAlign w:val="center"/>
           </w:tcPr>
           <w:p>
@@ -327,7 +319,7 @@
             </w:pPr>
             <w:r>
               <w:rPr>
-                <w:rFonts w:ascii="Calibri" w:hAnsi="Calibri" w:eastAsia="MS Mincho" w:cs="Calibri" w:asciiTheme="minorAscii" w:hAnsiTheme="minorAscii" w:cstheme="minorAscii"/>
+                <w:rFonts w:asciiTheme="minorHAnsi" w:eastAsia="MS Mincho" w:hAnsiTheme="minorHAnsi" w:cstheme="minorBidi"/>
                 <w:sz w:val="20"/>
                 <w:szCs w:val="20"/>
                 <w:lang w:eastAsia="es-ES"/>
@@ -346,7 +338,6 @@
         <w:tc>
           <w:tcPr>
             <w:tcW w:w="2547" w:type="dxa"/>
-            <w:tcMar/>
             <w:vAlign w:val="center"/>
           </w:tcPr>
           <w:p>
@@ -357,7 +348,7 @@
               </w:numPr>
               <w:spacing w:after="0"/>
               <w:rPr>
-                <w:rFonts w:eastAsia="MS Mincho" w:asciiTheme="minorHAnsi" w:hAnsiTheme="minorHAnsi" w:cstheme="minorHAnsi"/>
+                <w:rFonts w:asciiTheme="minorHAnsi" w:eastAsia="MS Mincho" w:hAnsiTheme="minorHAnsi" w:cstheme="minorHAnsi"/>
                 <w:b/>
                 <w:sz w:val="20"/>
                 <w:szCs w:val="20"/>
@@ -366,7 +357,7 @@
             </w:pPr>
             <w:r>
               <w:rPr>
-                <w:rFonts w:eastAsia="MS Mincho" w:asciiTheme="minorHAnsi" w:hAnsiTheme="minorHAnsi" w:cstheme="minorHAnsi"/>
+                <w:rFonts w:asciiTheme="minorHAnsi" w:eastAsia="MS Mincho" w:hAnsiTheme="minorHAnsi" w:cstheme="minorHAnsi"/>
                 <w:b/>
                 <w:sz w:val="20"/>
                 <w:szCs w:val="20"/>
@@ -379,7 +370,6 @@
         <w:tc>
           <w:tcPr>
             <w:tcW w:w="7796" w:type="dxa"/>
-            <w:tcMar/>
             <w:vAlign w:val="center"/>
           </w:tcPr>
           <w:p>
@@ -388,7 +378,7 @@
             </w:pPr>
             <w:r>
               <w:rPr>
-                <w:rFonts w:ascii="Calibri" w:hAnsi="Calibri" w:eastAsia="MS Mincho" w:cs="Calibri" w:asciiTheme="minorAscii" w:hAnsiTheme="minorAscii" w:cstheme="minorAscii"/>
+                <w:rFonts w:asciiTheme="minorHAnsi" w:eastAsia="MS Mincho" w:hAnsiTheme="minorHAnsi" w:cstheme="minorBidi"/>
                 <w:sz w:val="20"/>
                 <w:szCs w:val="20"/>
                 <w:lang w:eastAsia="es-ES"/>
@@ -407,7 +397,6 @@
         <w:tc>
           <w:tcPr>
             <w:tcW w:w="2547" w:type="dxa"/>
-            <w:tcMar/>
             <w:vAlign w:val="center"/>
           </w:tcPr>
           <w:p>
@@ -418,7 +407,7 @@
               </w:numPr>
               <w:spacing w:after="0"/>
               <w:rPr>
-                <w:rFonts w:eastAsia="MS Mincho" w:asciiTheme="minorHAnsi" w:hAnsiTheme="minorHAnsi" w:cstheme="minorHAnsi"/>
+                <w:rFonts w:asciiTheme="minorHAnsi" w:eastAsia="MS Mincho" w:hAnsiTheme="minorHAnsi" w:cstheme="minorHAnsi"/>
                 <w:b/>
                 <w:sz w:val="20"/>
                 <w:szCs w:val="20"/>
@@ -427,7 +416,7 @@
             </w:pPr>
             <w:r>
               <w:rPr>
-                <w:rFonts w:eastAsia="MS Mincho" w:asciiTheme="minorHAnsi" w:hAnsiTheme="minorHAnsi" w:cstheme="minorHAnsi"/>
+                <w:rFonts w:asciiTheme="minorHAnsi" w:eastAsia="MS Mincho" w:hAnsiTheme="minorHAnsi" w:cstheme="minorHAnsi"/>
                 <w:b/>
                 <w:sz w:val="20"/>
                 <w:szCs w:val="20"/>
@@ -440,21 +429,15 @@
         <w:tc>
           <w:tcPr>
             <w:tcW w:w="7796" w:type="dxa"/>
-            <w:tcMar/>
             <w:vAlign w:val="center"/>
           </w:tcPr>
           <w:p>
             <w:pPr>
-              <w:pStyle w:val="Normal"/>
-              <w:suppressLineNumbers w:val="0"/>
-              <w:bidi w:val="0"/>
-              <w:spacing w:before="0" w:beforeAutospacing="off" w:after="0" w:afterAutospacing="off" w:line="276" w:lineRule="auto"/>
-              <w:ind w:left="0" w:right="0"/>
-              <w:jc w:val="left"/>
+              <w:spacing w:after="0"/>
             </w:pPr>
             <w:r>
               <w:rPr>
-                <w:rFonts w:ascii="Calibri" w:hAnsi="Calibri" w:eastAsia="Calibri" w:cs="Calibri"/>
+                <w:rFonts w:cs="Calibri"/>
                 <w:sz w:val="20"/>
                 <w:szCs w:val="20"/>
               </w:rPr>
@@ -472,7 +455,6 @@
         <w:tc>
           <w:tcPr>
             <w:tcW w:w="2547" w:type="dxa"/>
-            <w:tcMar/>
             <w:vAlign w:val="center"/>
           </w:tcPr>
           <w:p>
@@ -483,7 +465,7 @@
               </w:numPr>
               <w:spacing w:after="0"/>
               <w:rPr>
-                <w:rFonts w:eastAsia="MS Mincho" w:asciiTheme="minorHAnsi" w:hAnsiTheme="minorHAnsi" w:cstheme="minorHAnsi"/>
+                <w:rFonts w:asciiTheme="minorHAnsi" w:eastAsia="MS Mincho" w:hAnsiTheme="minorHAnsi" w:cstheme="minorHAnsi"/>
                 <w:b/>
                 <w:sz w:val="20"/>
                 <w:szCs w:val="20"/>
@@ -492,7 +474,7 @@
             </w:pPr>
             <w:r>
               <w:rPr>
-                <w:rFonts w:eastAsia="MS Mincho" w:asciiTheme="minorHAnsi" w:hAnsiTheme="minorHAnsi" w:cstheme="minorHAnsi"/>
+                <w:rFonts w:asciiTheme="minorHAnsi" w:eastAsia="MS Mincho" w:hAnsiTheme="minorHAnsi" w:cstheme="minorHAnsi"/>
                 <w:b/>
                 <w:sz w:val="20"/>
                 <w:szCs w:val="20"/>
@@ -502,7 +484,7 @@
             </w:r>
             <w:r>
               <w:rPr>
-                <w:rFonts w:eastAsia="MS Mincho" w:asciiTheme="minorHAnsi" w:hAnsiTheme="minorHAnsi" w:cstheme="minorHAnsi"/>
+                <w:rFonts w:asciiTheme="minorHAnsi" w:eastAsia="MS Mincho" w:hAnsiTheme="minorHAnsi" w:cstheme="minorHAnsi"/>
                 <w:b/>
                 <w:sz w:val="20"/>
                 <w:szCs w:val="20"/>
@@ -512,7 +494,7 @@
             </w:r>
             <w:r>
               <w:rPr>
-                <w:rFonts w:eastAsia="MS Mincho" w:asciiTheme="minorHAnsi" w:hAnsiTheme="minorHAnsi" w:cstheme="minorHAnsi"/>
+                <w:rFonts w:asciiTheme="minorHAnsi" w:eastAsia="MS Mincho" w:hAnsiTheme="minorHAnsi" w:cstheme="minorHAnsi"/>
                 <w:b/>
                 <w:sz w:val="20"/>
                 <w:szCs w:val="20"/>
@@ -522,7 +504,7 @@
             </w:r>
             <w:r>
               <w:rPr>
-                <w:rFonts w:eastAsia="MS Mincho" w:asciiTheme="minorHAnsi" w:hAnsiTheme="minorHAnsi" w:cstheme="minorHAnsi"/>
+                <w:rFonts w:asciiTheme="minorHAnsi" w:eastAsia="MS Mincho" w:hAnsiTheme="minorHAnsi" w:cstheme="minorHAnsi"/>
                 <w:b/>
                 <w:sz w:val="20"/>
                 <w:szCs w:val="20"/>
@@ -535,7 +517,6 @@
         <w:tc>
           <w:tcPr>
             <w:tcW w:w="7796" w:type="dxa"/>
-            <w:tcMar/>
             <w:vAlign w:val="center"/>
           </w:tcPr>
           <w:p>
@@ -545,7 +526,7 @@
             </w:pPr>
             <w:r>
               <w:rPr>
-                <w:rFonts w:ascii="Calibri" w:hAnsi="Calibri" w:eastAsia="MS Mincho" w:cs="Calibri" w:asciiTheme="minorAscii" w:hAnsiTheme="minorAscii" w:cstheme="minorAscii"/>
+                <w:rFonts w:asciiTheme="minorHAnsi" w:eastAsia="MS Mincho" w:hAnsiTheme="minorHAnsi" w:cstheme="minorBidi"/>
                 <w:sz w:val="20"/>
                 <w:szCs w:val="20"/>
                 <w:lang w:eastAsia="es-ES"/>
@@ -572,12 +553,12 @@
         <w:tblW w:w="10432" w:type="dxa"/>
         <w:jc w:val="center"/>
         <w:tblBorders>
-          <w:top w:val="single" w:color="auto" w:sz="4" w:space="0"/>
-          <w:left w:val="single" w:color="auto" w:sz="4" w:space="0"/>
-          <w:bottom w:val="single" w:color="auto" w:sz="4" w:space="0"/>
-          <w:right w:val="single" w:color="auto" w:sz="4" w:space="0"/>
-          <w:insideH w:val="single" w:color="auto" w:sz="4" w:space="0"/>
-          <w:insideV w:val="single" w:color="auto" w:sz="4" w:space="0"/>
+          <w:top w:val="single" w:sz="4" w:space="0" w:color="auto"/>
+          <w:left w:val="single" w:sz="4" w:space="0" w:color="auto"/>
+          <w:bottom w:val="single" w:sz="4" w:space="0" w:color="auto"/>
+          <w:right w:val="single" w:sz="4" w:space="0" w:color="auto"/>
+          <w:insideH w:val="single" w:sz="4" w:space="0" w:color="auto"/>
+          <w:insideV w:val="single" w:sz="4" w:space="0" w:color="auto"/>
         </w:tblBorders>
         <w:tblLayout w:type="fixed"/>
         <w:tblCellMar>
@@ -594,12 +575,12 @@
       <w:tr>
         <w:trPr>
           <w:trHeight w:val="340"/>
+          <w:jc w:val="center"/>
         </w:trPr>
         <w:tc>
           <w:tcPr>
             <w:tcW w:w="2547" w:type="dxa"/>
             <w:shd w:val="clear" w:color="auto" w:fill="BFBFBF" w:themeFill="background1" w:themeFillShade="BF"/>
-            <w:tcMar/>
             <w:vAlign w:val="center"/>
           </w:tcPr>
           <w:p>
@@ -607,7 +588,7 @@
               <w:spacing w:after="0"/>
               <w:jc w:val="center"/>
               <w:rPr>
-                <w:rFonts w:eastAsia="MS Mincho" w:asciiTheme="minorHAnsi" w:hAnsiTheme="minorHAnsi" w:cstheme="minorHAnsi"/>
+                <w:rFonts w:asciiTheme="minorHAnsi" w:eastAsia="MS Mincho" w:hAnsiTheme="minorHAnsi" w:cstheme="minorHAnsi"/>
                 <w:b/>
                 <w:sz w:val="20"/>
                 <w:szCs w:val="20"/>
@@ -616,7 +597,7 @@
             </w:pPr>
             <w:r>
               <w:rPr>
-                <w:rFonts w:eastAsia="MS Mincho" w:asciiTheme="minorHAnsi" w:hAnsiTheme="minorHAnsi" w:cstheme="minorHAnsi"/>
+                <w:rFonts w:asciiTheme="minorHAnsi" w:eastAsia="MS Mincho" w:hAnsiTheme="minorHAnsi" w:cstheme="minorHAnsi"/>
                 <w:b/>
                 <w:sz w:val="20"/>
                 <w:szCs w:val="20"/>
@@ -630,7 +611,6 @@
           <w:tcPr>
             <w:tcW w:w="6638" w:type="dxa"/>
             <w:shd w:val="clear" w:color="auto" w:fill="BFBFBF" w:themeFill="background1" w:themeFillShade="BF"/>
-            <w:tcMar/>
             <w:vAlign w:val="center"/>
           </w:tcPr>
           <w:p>
@@ -638,7 +618,7 @@
               <w:spacing w:after="0"/>
               <w:jc w:val="center"/>
               <w:rPr>
-                <w:rFonts w:eastAsia="MS Mincho" w:asciiTheme="minorHAnsi" w:hAnsiTheme="minorHAnsi" w:cstheme="minorHAnsi"/>
+                <w:rFonts w:asciiTheme="minorHAnsi" w:eastAsia="MS Mincho" w:hAnsiTheme="minorHAnsi" w:cstheme="minorHAnsi"/>
                 <w:b/>
                 <w:sz w:val="20"/>
                 <w:szCs w:val="20"/>
@@ -647,7 +627,7 @@
             </w:pPr>
             <w:r>
               <w:rPr>
-                <w:rFonts w:eastAsia="MS Mincho" w:asciiTheme="minorHAnsi" w:hAnsiTheme="minorHAnsi" w:cstheme="minorHAnsi"/>
+                <w:rFonts w:asciiTheme="minorHAnsi" w:eastAsia="MS Mincho" w:hAnsiTheme="minorHAnsi" w:cstheme="minorHAnsi"/>
                 <w:b/>
                 <w:sz w:val="20"/>
                 <w:szCs w:val="20"/>
@@ -661,7 +641,6 @@
           <w:tcPr>
             <w:tcW w:w="1247" w:type="dxa"/>
             <w:shd w:val="clear" w:color="auto" w:fill="BFBFBF" w:themeFill="background1" w:themeFillShade="BF"/>
-            <w:tcMar/>
             <w:vAlign w:val="center"/>
           </w:tcPr>
           <w:p>
@@ -669,7 +648,7 @@
               <w:spacing w:after="0"/>
               <w:jc w:val="center"/>
               <w:rPr>
-                <w:rFonts w:eastAsia="MS Mincho" w:asciiTheme="minorHAnsi" w:hAnsiTheme="minorHAnsi" w:cstheme="minorHAnsi"/>
+                <w:rFonts w:asciiTheme="minorHAnsi" w:eastAsia="MS Mincho" w:hAnsiTheme="minorHAnsi" w:cstheme="minorHAnsi"/>
                 <w:b/>
                 <w:sz w:val="20"/>
                 <w:szCs w:val="20"/>
@@ -678,7 +657,7 @@
             </w:pPr>
             <w:r>
               <w:rPr>
-                <w:rFonts w:eastAsia="MS Mincho" w:asciiTheme="minorHAnsi" w:hAnsiTheme="minorHAnsi" w:cstheme="minorHAnsi"/>
+                <w:rFonts w:asciiTheme="minorHAnsi" w:eastAsia="MS Mincho" w:hAnsiTheme="minorHAnsi" w:cstheme="minorHAnsi"/>
                 <w:b/>
                 <w:sz w:val="20"/>
                 <w:szCs w:val="20"/>
@@ -692,38 +671,28 @@
       <w:tr>
         <w:trPr>
           <w:trHeight w:val="340"/>
+          <w:jc w:val="center"/>
         </w:trPr>
         <w:tc>
           <w:tcPr>
             <w:tcW w:w="2547" w:type="dxa"/>
-            <w:tcMar/>
             <w:vAlign w:val="center"/>
           </w:tcPr>
           <w:p>
             <w:pPr>
-              <w:spacing w:after="0" w:line="276" w:lineRule="auto"/>
-              <w:rPr>
-                <w:rFonts w:ascii="Calibri" w:hAnsi="Calibri" w:eastAsia="Calibri" w:cs="Calibri"/>
-                <w:noProof w:val="0"/>
-                <w:sz w:val="20"/>
-                <w:szCs w:val="20"/>
-                <w:lang w:val="es-CO"/>
+              <w:spacing w:after="0"/>
+              <w:rPr>
+                <w:rFonts w:cs="Calibri"/>
+                <w:sz w:val="20"/>
+                <w:szCs w:val="20"/>
               </w:rPr>
             </w:pPr>
             <w:r>
               <w:rPr>
-                <w:rFonts w:ascii="Calibri" w:hAnsi="Calibri" w:eastAsia="Calibri" w:cs="Calibri"/>
-                <w:b w:val="0"/>
-                <w:bCs w:val="0"/>
-                <w:i w:val="0"/>
-                <w:iCs w:val="0"/>
-                <w:caps w:val="0"/>
-                <w:smallCaps w:val="0"/>
-                <w:noProof w:val="0"/>
-                <w:color w:val="000000" w:themeColor="text1" w:themeTint="FF" w:themeShade="FF"/>
-                <w:sz w:val="20"/>
-                <w:szCs w:val="20"/>
-                <w:lang w:val="es-CO"/>
+                <w:rFonts w:cs="Calibri"/>
+                <w:color w:val="000000" w:themeColor="text1"/>
+                <w:sz w:val="20"/>
+                <w:szCs w:val="20"/>
               </w:rPr>
               <w:t>Implementación de salida analógica mediante PMOD DA3 y visualización en osciloscopio.</w:t>
             </w:r>
@@ -732,32 +701,18 @@
         <w:tc>
           <w:tcPr>
             <w:tcW w:w="6638" w:type="dxa"/>
-            <w:tcMar/>
             <w:vAlign w:val="center"/>
           </w:tcPr>
           <w:p>
             <w:pPr>
-              <w:spacing w:after="0" w:line="276" w:lineRule="auto"/>
-              <w:ind w:left="0"/>
-              <w:rPr>
-                <w:noProof w:val="0"/>
-                <w:lang w:val="es-CO"/>
-              </w:rPr>
+              <w:spacing w:after="0"/>
             </w:pPr>
             <w:r>
               <w:rPr>
-                <w:rFonts w:ascii="Calibri" w:hAnsi="Calibri" w:eastAsia="Calibri" w:cs="Calibri"/>
-                <w:b w:val="0"/>
-                <w:bCs w:val="0"/>
-                <w:i w:val="0"/>
-                <w:iCs w:val="0"/>
-                <w:caps w:val="0"/>
-                <w:smallCaps w:val="0"/>
-                <w:noProof w:val="0"/>
-                <w:color w:val="000000" w:themeColor="text1" w:themeTint="FF" w:themeShade="FF"/>
-                <w:sz w:val="20"/>
-                <w:szCs w:val="20"/>
-                <w:lang w:val="es-CO"/>
+                <w:rFonts w:cs="Calibri"/>
+                <w:color w:val="000000" w:themeColor="text1"/>
+                <w:sz w:val="20"/>
+                <w:szCs w:val="20"/>
               </w:rPr>
               <w:t>Se implementó la comunicación SPI entre la FPGA y el módulo DAC PMOD DA3 para convertir señales digitales a analógicas. Adicionalmente, se realizaron pruebas de visualización de las señales generadas utilizando un osciloscopio, verificando el correcto funcionamiento de la conversión digital–análoga.</w:t>
             </w:r>
@@ -766,7 +721,6 @@
         <w:tc>
           <w:tcPr>
             <w:tcW w:w="1247" w:type="dxa"/>
-            <w:tcMar/>
             <w:vAlign w:val="center"/>
           </w:tcPr>
           <w:p>
@@ -778,7 +732,7 @@
             </w:pPr>
             <w:r>
               <w:rPr>
-                <w:rFonts w:ascii="Calibri" w:hAnsi="Calibri" w:cs="Calibri" w:asciiTheme="minorAscii" w:hAnsiTheme="minorAscii" w:cstheme="minorAscii"/>
+                <w:rFonts w:asciiTheme="minorHAnsi" w:hAnsiTheme="minorHAnsi" w:cstheme="minorBidi"/>
                 <w:sz w:val="20"/>
                 <w:szCs w:val="20"/>
               </w:rPr>
@@ -786,7 +740,7 @@
             </w:r>
             <w:r>
               <w:rPr>
-                <w:rFonts w:ascii="Calibri" w:hAnsi="Calibri" w:cs="Calibri" w:asciiTheme="minorAscii" w:hAnsiTheme="minorAscii" w:cstheme="minorAscii"/>
+                <w:rFonts w:asciiTheme="minorHAnsi" w:hAnsiTheme="minorHAnsi" w:cstheme="minorBidi"/>
                 <w:sz w:val="20"/>
                 <w:szCs w:val="20"/>
               </w:rPr>
@@ -798,11 +752,11 @@
       <w:tr>
         <w:trPr>
           <w:trHeight w:val="340"/>
+          <w:jc w:val="center"/>
         </w:trPr>
         <w:tc>
           <w:tcPr>
             <w:tcW w:w="2547" w:type="dxa"/>
-            <w:tcMar/>
             <w:vAlign w:val="center"/>
           </w:tcPr>
           <w:p>
@@ -810,70 +764,38 @@
               <w:autoSpaceDE w:val="0"/>
               <w:autoSpaceDN w:val="0"/>
               <w:adjustRightInd w:val="0"/>
-              <w:spacing w:after="0" w:line="276" w:lineRule="auto"/>
-              <w:rPr>
-                <w:rFonts w:ascii="Calibri" w:hAnsi="Calibri" w:eastAsia="Calibri" w:cs="Calibri"/>
-                <w:b w:val="0"/>
-                <w:bCs w:val="0"/>
-                <w:i w:val="0"/>
-                <w:iCs w:val="0"/>
-                <w:caps w:val="0"/>
-                <w:smallCaps w:val="0"/>
-                <w:noProof w:val="0"/>
-                <w:color w:val="000000" w:themeColor="text1" w:themeTint="FF" w:themeShade="FF"/>
-                <w:sz w:val="20"/>
-                <w:szCs w:val="20"/>
-                <w:lang w:val="es-CO"/>
+              <w:spacing w:after="0"/>
+              <w:rPr>
+                <w:rFonts w:cs="Calibri"/>
+                <w:color w:val="000000" w:themeColor="text1"/>
+                <w:sz w:val="20"/>
+                <w:szCs w:val="20"/>
               </w:rPr>
             </w:pPr>
             <w:r>
               <w:rPr>
-                <w:rFonts w:ascii="Calibri" w:hAnsi="Calibri" w:eastAsia="Calibri" w:cs="Calibri"/>
-                <w:b w:val="0"/>
-                <w:bCs w:val="0"/>
-                <w:i w:val="0"/>
-                <w:iCs w:val="0"/>
-                <w:caps w:val="0"/>
-                <w:smallCaps w:val="0"/>
-                <w:noProof w:val="0"/>
-                <w:color w:val="000000" w:themeColor="text1" w:themeTint="FF" w:themeShade="FF"/>
-                <w:sz w:val="20"/>
-                <w:szCs w:val="20"/>
-                <w:lang w:val="es-CO"/>
+                <w:rFonts w:cs="Calibri"/>
+                <w:color w:val="000000" w:themeColor="text1"/>
+                <w:sz w:val="20"/>
+                <w:szCs w:val="20"/>
               </w:rPr>
               <w:t>Diseño e implementación de un convertidor B</w:t>
             </w:r>
             <w:r>
               <w:rPr>
-                <w:rFonts w:ascii="Calibri" w:hAnsi="Calibri" w:eastAsia="Calibri" w:cs="Calibri"/>
-                <w:b w:val="0"/>
-                <w:bCs w:val="0"/>
-                <w:i w:val="0"/>
-                <w:iCs w:val="0"/>
-                <w:caps w:val="0"/>
-                <w:smallCaps w:val="0"/>
-                <w:noProof w:val="0"/>
-                <w:color w:val="000000" w:themeColor="text1" w:themeTint="FF" w:themeShade="FF"/>
-                <w:sz w:val="20"/>
-                <w:szCs w:val="20"/>
-                <w:lang w:val="es-CO"/>
+                <w:rFonts w:cs="Calibri"/>
+                <w:color w:val="000000" w:themeColor="text1"/>
+                <w:sz w:val="20"/>
+                <w:szCs w:val="20"/>
               </w:rPr>
               <w:t>oost</w:t>
             </w:r>
             <w:r>
               <w:rPr>
-                <w:rFonts w:ascii="Calibri" w:hAnsi="Calibri" w:eastAsia="Calibri" w:cs="Calibri"/>
-                <w:b w:val="0"/>
-                <w:bCs w:val="0"/>
-                <w:i w:val="0"/>
-                <w:iCs w:val="0"/>
-                <w:caps w:val="0"/>
-                <w:smallCaps w:val="0"/>
-                <w:noProof w:val="0"/>
-                <w:color w:val="000000" w:themeColor="text1" w:themeTint="FF" w:themeShade="FF"/>
-                <w:sz w:val="20"/>
-                <w:szCs w:val="20"/>
-                <w:lang w:val="es-CO"/>
+                <w:rFonts w:cs="Calibri"/>
+                <w:color w:val="000000" w:themeColor="text1"/>
+                <w:sz w:val="20"/>
+                <w:szCs w:val="20"/>
               </w:rPr>
               <w:t xml:space="preserve"> controlado en VHDL.</w:t>
             </w:r>
@@ -882,76 +804,42 @@
         <w:tc>
           <w:tcPr>
             <w:tcW w:w="6638" w:type="dxa"/>
-            <w:tcMar/>
             <w:vAlign w:val="center"/>
           </w:tcPr>
           <w:p>
             <w:pPr>
-              <w:spacing w:after="0" w:line="276" w:lineRule="auto"/>
-              <w:ind w:left="0"/>
-              <w:rPr>
-                <w:rFonts w:ascii="Calibri" w:hAnsi="Calibri" w:eastAsia="Calibri" w:cs="Calibri"/>
-                <w:b w:val="0"/>
-                <w:bCs w:val="0"/>
-                <w:i w:val="0"/>
-                <w:iCs w:val="0"/>
-                <w:caps w:val="0"/>
-                <w:smallCaps w:val="0"/>
-                <w:noProof w:val="0"/>
-                <w:color w:val="000000" w:themeColor="text1" w:themeTint="FF" w:themeShade="FF"/>
-                <w:sz w:val="20"/>
-                <w:szCs w:val="20"/>
-                <w:lang w:val="es-CO"/>
+              <w:spacing w:after="0"/>
+              <w:rPr>
+                <w:rFonts w:cs="Calibri"/>
+                <w:color w:val="000000" w:themeColor="text1"/>
+                <w:sz w:val="20"/>
+                <w:szCs w:val="20"/>
               </w:rPr>
             </w:pPr>
             <w:r>
               <w:rPr>
-                <w:rFonts w:ascii="Calibri" w:hAnsi="Calibri" w:eastAsia="Calibri" w:cs="Calibri"/>
-                <w:b w:val="0"/>
-                <w:bCs w:val="0"/>
-                <w:i w:val="0"/>
-                <w:iCs w:val="0"/>
-                <w:caps w:val="0"/>
-                <w:smallCaps w:val="0"/>
-                <w:noProof w:val="0"/>
-                <w:color w:val="000000" w:themeColor="text1" w:themeTint="FF" w:themeShade="FF"/>
-                <w:sz w:val="20"/>
-                <w:szCs w:val="20"/>
-                <w:lang w:val="es-CO"/>
+                <w:rFonts w:cs="Calibri"/>
+                <w:color w:val="000000" w:themeColor="text1"/>
+                <w:sz w:val="20"/>
+                <w:szCs w:val="20"/>
               </w:rPr>
               <w:t>Se desarrolló un sistema basado en VHDL para el control de un convertidor B</w:t>
             </w:r>
             <w:r>
               <w:rPr>
-                <w:rFonts w:ascii="Calibri" w:hAnsi="Calibri" w:eastAsia="Calibri" w:cs="Calibri"/>
-                <w:b w:val="0"/>
-                <w:bCs w:val="0"/>
-                <w:i w:val="0"/>
-                <w:iCs w:val="0"/>
-                <w:caps w:val="0"/>
-                <w:smallCaps w:val="0"/>
-                <w:noProof w:val="0"/>
-                <w:color w:val="000000" w:themeColor="text1" w:themeTint="FF" w:themeShade="FF"/>
-                <w:sz w:val="20"/>
-                <w:szCs w:val="20"/>
-                <w:lang w:val="es-CO"/>
+                <w:rFonts w:cs="Calibri"/>
+                <w:color w:val="000000" w:themeColor="text1"/>
+                <w:sz w:val="20"/>
+                <w:szCs w:val="20"/>
               </w:rPr>
               <w:t>oost</w:t>
             </w:r>
             <w:r>
               <w:rPr>
-                <w:rFonts w:ascii="Calibri" w:hAnsi="Calibri" w:eastAsia="Calibri" w:cs="Calibri"/>
-                <w:b w:val="0"/>
-                <w:bCs w:val="0"/>
-                <w:i w:val="0"/>
-                <w:iCs w:val="0"/>
-                <w:caps w:val="0"/>
-                <w:smallCaps w:val="0"/>
-                <w:noProof w:val="0"/>
-                <w:color w:val="000000" w:themeColor="text1" w:themeTint="FF" w:themeShade="FF"/>
-                <w:sz w:val="20"/>
-                <w:szCs w:val="20"/>
-                <w:lang w:val="es-CO"/>
+                <w:rFonts w:cs="Calibri"/>
+                <w:color w:val="000000" w:themeColor="text1"/>
+                <w:sz w:val="20"/>
+                <w:szCs w:val="20"/>
               </w:rPr>
               <w:t>, permitiendo aumentar y regular el nivel de voltaje de salida mediante señales PWM generadas desde la FPGA. Se realizaron pruebas funcionales de conmutación y análisis del comportamiento del sistema ante diferentes ciclos de trabajo.</w:t>
             </w:r>
@@ -960,7 +848,6 @@
         <w:tc>
           <w:tcPr>
             <w:tcW w:w="1247" w:type="dxa"/>
-            <w:tcMar/>
             <w:vAlign w:val="center"/>
           </w:tcPr>
           <w:p>
@@ -972,7 +859,7 @@
             </w:pPr>
             <w:r>
               <w:rPr>
-                <w:rFonts w:ascii="Calibri" w:hAnsi="Calibri" w:cs="Calibri" w:asciiTheme="minorAscii" w:hAnsiTheme="minorAscii" w:cstheme="minorAscii"/>
+                <w:rFonts w:asciiTheme="minorHAnsi" w:hAnsiTheme="minorHAnsi" w:cstheme="minorBidi"/>
                 <w:sz w:val="20"/>
                 <w:szCs w:val="20"/>
               </w:rPr>
@@ -984,16 +871,15 @@
       <w:tr>
         <w:trPr>
           <w:trHeight w:val="340"/>
+          <w:jc w:val="center"/>
         </w:trPr>
         <w:tc>
           <w:tcPr>
             <w:tcW w:w="2547" w:type="dxa"/>
-            <w:tcMar/>
             <w:vAlign w:val="center"/>
           </w:tcPr>
           <w:p>
             <w:pPr>
-              <w:pStyle w:val="Normal"/>
               <w:autoSpaceDE w:val="0"/>
               <w:autoSpaceDN w:val="0"/>
               <w:adjustRightInd w:val="0"/>
@@ -1001,11 +887,9 @@
             </w:pPr>
             <w:r>
               <w:rPr>
-                <w:rFonts w:ascii="Calibri" w:hAnsi="Calibri" w:eastAsia="Calibri" w:cs="Calibri"/>
-                <w:noProof w:val="0"/>
-                <w:sz w:val="20"/>
-                <w:szCs w:val="20"/>
-                <w:lang w:val="es-CO"/>
+                <w:rFonts w:cs="Calibri"/>
+                <w:sz w:val="20"/>
+                <w:szCs w:val="20"/>
               </w:rPr>
               <w:t>Diseño de una etapa de control mediante amplificadores operacionales para un convertidor DC-DC.</w:t>
             </w:r>
@@ -1014,7 +898,6 @@
         <w:tc>
           <w:tcPr>
             <w:tcW w:w="6638" w:type="dxa"/>
-            <w:tcMar/>
             <w:vAlign w:val="center"/>
           </w:tcPr>
           <w:p>
@@ -1025,7 +908,7 @@
             </w:pPr>
             <w:r>
               <w:rPr>
-                <w:rFonts w:ascii="Calibri" w:hAnsi="Calibri" w:cs="Calibri" w:asciiTheme="minorAscii" w:hAnsiTheme="minorAscii" w:cstheme="minorAscii"/>
+                <w:rFonts w:asciiTheme="minorHAnsi" w:hAnsiTheme="minorHAnsi" w:cstheme="minorBidi"/>
                 <w:sz w:val="20"/>
                 <w:szCs w:val="20"/>
               </w:rPr>
@@ -1033,7 +916,7 @@
             </w:r>
             <w:r>
               <w:rPr>
-                <w:rFonts w:ascii="Calibri" w:hAnsi="Calibri" w:cs="Calibri" w:asciiTheme="minorAscii" w:hAnsiTheme="minorAscii" w:cstheme="minorAscii"/>
+                <w:rFonts w:asciiTheme="minorHAnsi" w:hAnsiTheme="minorHAnsi" w:cstheme="minorBidi"/>
                 <w:sz w:val="20"/>
                 <w:szCs w:val="20"/>
               </w:rPr>
@@ -1041,7 +924,7 @@
             </w:r>
             <w:r>
               <w:rPr>
-                <w:rFonts w:ascii="Calibri" w:hAnsi="Calibri" w:cs="Calibri" w:asciiTheme="minorAscii" w:hAnsiTheme="minorAscii" w:cstheme="minorAscii"/>
+                <w:rFonts w:asciiTheme="minorHAnsi" w:hAnsiTheme="minorHAnsi" w:cstheme="minorBidi"/>
                 <w:sz w:val="20"/>
                 <w:szCs w:val="20"/>
               </w:rPr>
@@ -1052,7 +935,6 @@
         <w:tc>
           <w:tcPr>
             <w:tcW w:w="1247" w:type="dxa"/>
-            <w:tcMar/>
             <w:vAlign w:val="center"/>
           </w:tcPr>
           <w:p>
@@ -1064,7 +946,7 @@
             </w:pPr>
             <w:r>
               <w:rPr>
-                <w:rFonts w:ascii="Calibri" w:hAnsi="Calibri" w:cs="Calibri" w:asciiTheme="minorAscii" w:hAnsiTheme="minorAscii" w:cstheme="minorAscii"/>
+                <w:rFonts w:asciiTheme="minorHAnsi" w:hAnsiTheme="minorHAnsi" w:cstheme="minorBidi"/>
                 <w:sz w:val="20"/>
                 <w:szCs w:val="20"/>
               </w:rPr>
@@ -1076,17 +958,16 @@
     </w:tbl>
     <w:p>
       <w:pPr>
-        <w:pStyle w:val="Normal"/>
         <w:spacing w:after="0"/>
         <w:rPr>
-          <w:rFonts w:ascii="Calibri" w:hAnsi="Calibri" w:cs="Calibri" w:asciiTheme="minorAscii" w:hAnsiTheme="minorAscii" w:cstheme="minorAscii"/>
+          <w:rFonts w:asciiTheme="minorHAnsi" w:hAnsiTheme="minorHAnsi" w:cstheme="minorBidi"/>
           <w:sz w:val="20"/>
           <w:szCs w:val="20"/>
         </w:rPr>
       </w:pPr>
       <w:r>
         <w:rPr>
-          <w:rFonts w:ascii="Calibri" w:hAnsi="Calibri" w:cs="Calibri" w:asciiTheme="minorAscii" w:hAnsiTheme="minorAscii" w:cstheme="minorAscii"/>
+          <w:rFonts w:asciiTheme="minorHAnsi" w:hAnsiTheme="minorHAnsi" w:cstheme="minorBidi"/>
           <w:sz w:val="20"/>
           <w:szCs w:val="20"/>
         </w:rPr>
@@ -1094,7 +975,7 @@
       </w:r>
       <w:r>
         <w:rPr>
-          <w:rFonts w:ascii="Calibri" w:hAnsi="Calibri" w:cs="Calibri" w:asciiTheme="minorAscii" w:hAnsiTheme="minorAscii" w:cstheme="minorAscii"/>
+          <w:rFonts w:asciiTheme="minorHAnsi" w:hAnsiTheme="minorHAnsi" w:cstheme="minorBidi"/>
           <w:sz w:val="20"/>
           <w:szCs w:val="20"/>
         </w:rPr>
@@ -1182,10 +1063,9 @@
     </w:tbl>
     <w:p>
       <w:pPr>
-        <w:pStyle w:val="Normal"/>
         <w:spacing w:after="0"/>
         <w:rPr>
-          <w:rFonts w:ascii="Calibri" w:hAnsi="Calibri" w:cs="Calibri" w:asciiTheme="minorAscii" w:hAnsiTheme="minorAscii" w:cstheme="minorAscii"/>
+          <w:rFonts w:asciiTheme="minorHAnsi" w:hAnsiTheme="minorHAnsi" w:cstheme="minorBidi"/>
           <w:sz w:val="20"/>
           <w:szCs w:val="20"/>
         </w:rPr>
@@ -1193,27 +1073,29 @@
     </w:p>
     <w:p>
       <w:pPr>
-        <w:pStyle w:val="Normal"/>
         <w:spacing w:after="0"/>
       </w:pPr>
       <w:r>
+        <w:rPr>
+          <w:noProof/>
+        </w:rPr>
         <w:drawing>
-          <wp:inline wp14:editId="19ECE972" wp14:anchorId="42147A49">
+          <wp:inline distT="0" distB="0" distL="0" distR="0" wp14:anchorId="42147A49" wp14:editId="19ECE972">
             <wp:extent cx="1115054" cy="534924"/>
             <wp:effectExtent l="0" t="0" r="0" b="0"/>
             <wp:docPr id="1064692444" name="drawing"/>
             <wp:cNvGraphicFramePr>
-              <a:graphicFrameLocks noChangeAspect="1"/>
+              <a:graphicFrameLocks xmlns:a="http://schemas.openxmlformats.org/drawingml/2006/main" noChangeAspect="1"/>
             </wp:cNvGraphicFramePr>
-            <a:graphic>
-              <a:graphicData xmlns:a="http://schemas.openxmlformats.org/drawingml/2006/main" uri="http://schemas.openxmlformats.org/drawingml/2006/picture">
+            <a:graphic xmlns:a="http://schemas.openxmlformats.org/drawingml/2006/main">
+              <a:graphicData uri="http://schemas.openxmlformats.org/drawingml/2006/picture">
                 <pic:pic xmlns:pic="http://schemas.openxmlformats.org/drawingml/2006/picture">
                   <pic:nvPicPr>
                     <pic:cNvPr id="1064692444" name="Picture 1064692444"/>
                     <pic:cNvPicPr/>
                   </pic:nvPicPr>
                   <pic:blipFill>
-                    <a:blip xmlns:r="http://schemas.openxmlformats.org/officeDocument/2006/relationships" r:embed="rId587658707">
+                    <a:blip r:embed="rId9">
                       <a:extLst>
                         <a:ext uri="{28A0092B-C50C-407E-A947-70E740481C1C}">
                           <a14:useLocalDpi xmlns:a14="http://schemas.microsoft.com/office/drawing/2010/main"/>
@@ -1225,9 +1107,76 @@
                     </a:stretch>
                   </pic:blipFill>
                   <pic:spPr>
-                    <a:xfrm rot="0">
+                    <a:xfrm>
                       <a:off x="0" y="0"/>
                       <a:ext cx="1115054" cy="534924"/>
+                    </a:xfrm>
+                    <a:prstGeom prst="rect">
+                      <a:avLst/>
+                    </a:prstGeom>
+                  </pic:spPr>
+                </pic:pic>
+              </a:graphicData>
+            </a:graphic>
+          </wp:inline>
+        </w:drawing>
+      </w:r>
+      <w:r>
+        <w:tab/>
+      </w:r>
+      <w:r>
+        <w:tab/>
+      </w:r>
+      <w:r>
+        <w:tab/>
+      </w:r>
+      <w:r>
+        <w:tab/>
+      </w:r>
+      <w:r>
+        <w:tab/>
+      </w:r>
+      <w:r>
+        <w:tab/>
+      </w:r>
+      <w:r>
+        <w:tab/>
+      </w:r>
+      <w:r>
+        <w:rPr>
+          <w:noProof/>
+        </w:rPr>
+        <w:drawing>
+          <wp:inline distT="0" distB="0" distL="0" distR="0" wp14:anchorId="58DB0F83" wp14:editId="142A8BFC">
+            <wp:extent cx="1143431" cy="330778"/>
+            <wp:effectExtent l="0" t="0" r="0" b="0"/>
+            <wp:docPr id="501099264" name="Imagen 1"/>
+            <wp:cNvGraphicFramePr>
+              <a:graphicFrameLocks xmlns:a="http://schemas.openxmlformats.org/drawingml/2006/main" noChangeAspect="1"/>
+            </wp:cNvGraphicFramePr>
+            <a:graphic xmlns:a="http://schemas.openxmlformats.org/drawingml/2006/main">
+              <a:graphicData uri="http://schemas.openxmlformats.org/drawingml/2006/picture">
+                <pic:pic xmlns:pic="http://schemas.openxmlformats.org/drawingml/2006/picture">
+                  <pic:nvPicPr>
+                    <pic:cNvPr id="501099264" name="Imagen 501099264"/>
+                    <pic:cNvPicPr/>
+                  </pic:nvPicPr>
+                  <pic:blipFill>
+                    <a:blip r:embed="rId10" cstate="print">
+                      <a:extLst>
+                        <a:ext uri="{28A0092B-C50C-407E-A947-70E740481C1C}">
+                          <a14:useLocalDpi xmlns:a14="http://schemas.microsoft.com/office/drawing/2010/main" val="0"/>
+                        </a:ext>
+                      </a:extLst>
+                    </a:blip>
+                    <a:stretch>
+                      <a:fillRect/>
+                    </a:stretch>
+                  </pic:blipFill>
+                  <pic:spPr>
+                    <a:xfrm>
+                      <a:off x="0" y="0"/>
+                      <a:ext cx="1268260" cy="366889"/>
                     </a:xfrm>
                     <a:prstGeom prst="rect">
                       <a:avLst/>
@@ -1242,16 +1191,11 @@
     </w:p>
     <w:p>
       <w:pPr>
-        <w:pStyle w:val="Normal"/>
         <w:spacing w:after="0"/>
       </w:pPr>
       <w:r>
         <w:rPr>
-          <w:rFonts w:ascii="Calibri" w:hAnsi="Calibri" w:eastAsia="Calibri" w:cs="Calibri"/>
-          <w:noProof w:val="0"/>
-          <w:sz w:val="22"/>
-          <w:szCs w:val="22"/>
-          <w:lang w:val="es-CO"/>
+          <w:rFonts w:cs="Calibri"/>
         </w:rPr>
         <w:t>_____________________                                                                                 ______________________</w:t>
       </w:r>
@@ -1267,7 +1211,7 @@
       </w:pPr>
       <w:r>
         <w:rPr>
-          <w:rFonts w:eastAsia="MS Mincho" w:asciiTheme="minorHAnsi" w:hAnsiTheme="minorHAnsi" w:cstheme="minorHAnsi"/>
+          <w:rFonts w:asciiTheme="minorHAnsi" w:eastAsia="MS Mincho" w:hAnsiTheme="minorHAnsi" w:cstheme="minorHAnsi"/>
           <w:b/>
           <w:sz w:val="20"/>
           <w:szCs w:val="20"/>
@@ -1277,7 +1221,7 @@
       </w:r>
       <w:r>
         <w:rPr>
-          <w:rFonts w:eastAsia="MS Mincho" w:asciiTheme="minorHAnsi" w:hAnsiTheme="minorHAnsi" w:cstheme="minorHAnsi"/>
+          <w:rFonts w:asciiTheme="minorHAnsi" w:eastAsia="MS Mincho" w:hAnsiTheme="minorHAnsi" w:cstheme="minorHAnsi"/>
           <w:b/>
           <w:sz w:val="20"/>
           <w:szCs w:val="20"/>
@@ -1287,7 +1231,7 @@
       </w:r>
       <w:r>
         <w:rPr>
-          <w:rFonts w:eastAsia="MS Mincho" w:asciiTheme="minorHAnsi" w:hAnsiTheme="minorHAnsi" w:cstheme="minorHAnsi"/>
+          <w:rFonts w:asciiTheme="minorHAnsi" w:eastAsia="MS Mincho" w:hAnsiTheme="minorHAnsi" w:cstheme="minorHAnsi"/>
           <w:b/>
           <w:sz w:val="20"/>
           <w:szCs w:val="20"/>
@@ -1297,7 +1241,7 @@
       </w:r>
       <w:r>
         <w:rPr>
-          <w:rFonts w:eastAsia="MS Mincho" w:asciiTheme="minorHAnsi" w:hAnsiTheme="minorHAnsi" w:cstheme="minorHAnsi"/>
+          <w:rFonts w:asciiTheme="minorHAnsi" w:eastAsia="MS Mincho" w:hAnsiTheme="minorHAnsi" w:cstheme="minorHAnsi"/>
           <w:b/>
           <w:sz w:val="20"/>
           <w:szCs w:val="20"/>
@@ -1307,7 +1251,7 @@
       </w:r>
       <w:r>
         <w:rPr>
-          <w:rFonts w:eastAsia="MS Mincho" w:asciiTheme="minorHAnsi" w:hAnsiTheme="minorHAnsi" w:cstheme="minorHAnsi"/>
+          <w:rFonts w:asciiTheme="minorHAnsi" w:eastAsia="MS Mincho" w:hAnsiTheme="minorHAnsi" w:cstheme="minorHAnsi"/>
           <w:b/>
           <w:sz w:val="20"/>
           <w:szCs w:val="20"/>
@@ -1317,7 +1261,7 @@
       </w:r>
       <w:r>
         <w:rPr>
-          <w:rFonts w:eastAsia="MS Mincho" w:asciiTheme="minorHAnsi" w:hAnsiTheme="minorHAnsi" w:cstheme="minorHAnsi"/>
+          <w:rFonts w:asciiTheme="minorHAnsi" w:eastAsia="MS Mincho" w:hAnsiTheme="minorHAnsi" w:cstheme="minorHAnsi"/>
           <w:b/>
           <w:sz w:val="20"/>
           <w:szCs w:val="20"/>
@@ -1327,7 +1271,7 @@
       </w:r>
       <w:r>
         <w:rPr>
-          <w:rFonts w:eastAsia="MS Mincho" w:asciiTheme="minorHAnsi" w:hAnsiTheme="minorHAnsi" w:cstheme="minorHAnsi"/>
+          <w:rFonts w:asciiTheme="minorHAnsi" w:eastAsia="MS Mincho" w:hAnsiTheme="minorHAnsi" w:cstheme="minorHAnsi"/>
           <w:b/>
           <w:sz w:val="20"/>
           <w:szCs w:val="20"/>
@@ -1337,7 +1281,7 @@
       </w:r>
       <w:r>
         <w:rPr>
-          <w:rFonts w:eastAsia="MS Mincho" w:asciiTheme="minorHAnsi" w:hAnsiTheme="minorHAnsi" w:cstheme="minorHAnsi"/>
+          <w:rFonts w:asciiTheme="minorHAnsi" w:eastAsia="MS Mincho" w:hAnsiTheme="minorHAnsi" w:cstheme="minorHAnsi"/>
           <w:b/>
           <w:sz w:val="20"/>
           <w:szCs w:val="20"/>
@@ -1348,7 +1292,7 @@
       <w:proofErr w:type="spellStart"/>
       <w:r>
         <w:rPr>
-          <w:rFonts w:eastAsia="MS Mincho" w:asciiTheme="minorHAnsi" w:hAnsiTheme="minorHAnsi" w:cstheme="minorHAnsi"/>
+          <w:rFonts w:asciiTheme="minorHAnsi" w:eastAsia="MS Mincho" w:hAnsiTheme="minorHAnsi" w:cstheme="minorHAnsi"/>
           <w:b/>
           <w:sz w:val="20"/>
           <w:szCs w:val="20"/>
@@ -1359,7 +1303,7 @@
       <w:proofErr w:type="spellEnd"/>
       <w:r>
         <w:rPr>
-          <w:rFonts w:eastAsia="MS Mincho" w:asciiTheme="minorHAnsi" w:hAnsiTheme="minorHAnsi" w:cstheme="minorHAnsi"/>
+          <w:rFonts w:asciiTheme="minorHAnsi" w:eastAsia="MS Mincho" w:hAnsiTheme="minorHAnsi" w:cstheme="minorHAnsi"/>
           <w:b/>
           <w:sz w:val="20"/>
           <w:szCs w:val="20"/>
@@ -1369,7 +1313,7 @@
       </w:r>
       <w:r>
         <w:rPr>
-          <w:rFonts w:eastAsia="MS Mincho" w:asciiTheme="minorHAnsi" w:hAnsiTheme="minorHAnsi" w:cstheme="minorHAnsi"/>
+          <w:rFonts w:asciiTheme="minorHAnsi" w:eastAsia="MS Mincho" w:hAnsiTheme="minorHAnsi" w:cstheme="minorHAnsi"/>
           <w:b/>
           <w:sz w:val="20"/>
           <w:szCs w:val="20"/>
@@ -1389,8 +1333,8 @@
       </w:pPr>
     </w:p>
     <w:sectPr>
-      <w:headerReference w:type="default" r:id="rId6"/>
-      <w:pgSz w:w="12240" w:h="15840" w:orient="portrait"/>
+      <w:headerReference w:type="default" r:id="rId11"/>
+      <w:pgSz w:w="12240" w:h="15840"/>
       <w:pgMar w:top="1701" w:right="1134" w:bottom="1701" w:left="1134" w:header="709" w:footer="709" w:gutter="0"/>
       <w:cols w:space="708"/>
       <w:docGrid w:linePitch="360"/>
@@ -1450,18 +1394,18 @@
 </file>
 
 <file path=word/header1.xml><?xml version="1.0" encoding="utf-8"?>
-<w:hdr xmlns:wpc="http://schemas.microsoft.com/office/word/2010/wordprocessingCanvas" xmlns:cx="http://schemas.microsoft.com/office/drawing/2014/chartex" xmlns:cx1="http://schemas.microsoft.com/office/drawing/2015/9/8/chartex" xmlns:cx2="http://schemas.microsoft.com/office/drawing/2015/10/21/chartex" xmlns:cx3="http://schemas.microsoft.com/office/drawing/2016/5/9/chartex" xmlns:cx4="http://schemas.microsoft.com/office/drawing/2016/5/10/chartex" xmlns:cx5="http://schemas.microsoft.com/office/drawing/2016/5/11/chartex" xmlns:cx6="http://schemas.microsoft.com/office/drawing/2016/5/12/chartex" xmlns:cx7="http://schemas.microsoft.com/office/drawing/2016/5/13/chartex" xmlns:cx8="http://schemas.microsoft.com/office/drawing/2016/5/14/chartex" xmlns:mc="http://schemas.openxmlformats.org/markup-compatibility/2006" xmlns:aink="http://schemas.microsoft.com/office/drawing/2016/ink" xmlns:am3d="http://schemas.microsoft.com/office/drawing/2017/model3d" xmlns:o="urn:schemas-microsoft-com:office:office" xmlns:oel="http://schemas.microsoft.com/office/2019/extlst" xmlns:r="http://schemas.openxmlformats.org/officeDocument/2006/relationships" xmlns:m="http://schemas.openxmlformats.org/officeDocument/2006/math" xmlns:v="urn:schemas-microsoft-com:vml" xmlns:wp14="http://schemas.microsoft.com/office/word/2010/wordprocessingDrawing" xmlns:wp="http://schemas.openxmlformats.org/drawingml/2006/wordprocessingDrawing" xmlns:w10="urn:schemas-microsoft-com:office:word" xmlns:w="http://schemas.openxmlformats.org/wordprocessingml/2006/main" xmlns:w14="http://schemas.microsoft.com/office/word/2010/wordml" xmlns:w15="http://schemas.microsoft.com/office/word/2012/wordml" xmlns:w16cex="http://schemas.microsoft.com/office/word/2018/wordml/cex" xmlns:w16cid="http://schemas.microsoft.com/office/word/2016/wordml/cid" xmlns:w16="http://schemas.microsoft.com/office/word/2018/wordml" xmlns:w16du="http://schemas.microsoft.com/office/word/2023/wordml/word16du" xmlns:w16sdtdh="http://schemas.microsoft.com/office/word/2020/wordml/sdtdatahash" xmlns:w16sdtfl="http://schemas.microsoft.com/office/word/2024/wordml/sdtformatlock" xmlns:w16se="http://schemas.microsoft.com/office/word/2015/wordml/symex" xmlns:wpg="http://schemas.microsoft.com/office/word/2010/wordprocessingGroup" xmlns:wpi="http://schemas.microsoft.com/office/word/2010/wordprocessingInk" xmlns:wne="http://schemas.microsoft.com/office/word/2006/wordml" xmlns:wps="http://schemas.microsoft.com/office/word/2010/wordprocessingShape" xmlns:a="http://schemas.openxmlformats.org/drawingml/2006/main" xmlns:pic="http://schemas.openxmlformats.org/drawingml/2006/picture" xmlns:a14="http://schemas.microsoft.com/office/drawing/2010/main" mc:Ignorable="w14 w15 w16se w16cid w16 w16cex w16sdtdh w16sdtfl w16du wp14">
+<w:hdr xmlns:wpc="http://schemas.microsoft.com/office/word/2010/wordprocessingCanvas" xmlns:cx="http://schemas.microsoft.com/office/drawing/2014/chartex" xmlns:cx1="http://schemas.microsoft.com/office/drawing/2015/9/8/chartex" xmlns:cx2="http://schemas.microsoft.com/office/drawing/2015/10/21/chartex" xmlns:cx3="http://schemas.microsoft.com/office/drawing/2016/5/9/chartex" xmlns:cx4="http://schemas.microsoft.com/office/drawing/2016/5/10/chartex" xmlns:cx5="http://schemas.microsoft.com/office/drawing/2016/5/11/chartex" xmlns:cx6="http://schemas.microsoft.com/office/drawing/2016/5/12/chartex" xmlns:cx7="http://schemas.microsoft.com/office/drawing/2016/5/13/chartex" xmlns:cx8="http://schemas.microsoft.com/office/drawing/2016/5/14/chartex" xmlns:mc="http://schemas.openxmlformats.org/markup-compatibility/2006" xmlns:aink="http://schemas.microsoft.com/office/drawing/2016/ink" xmlns:am3d="http://schemas.microsoft.com/office/drawing/2017/model3d" xmlns:o="urn:schemas-microsoft-com:office:office" xmlns:oel="http://schemas.microsoft.com/office/2019/extlst" xmlns:r="http://schemas.openxmlformats.org/officeDocument/2006/relationships" xmlns:m="http://schemas.openxmlformats.org/officeDocument/2006/math" xmlns:v="urn:schemas-microsoft-com:vml" xmlns:wp14="http://schemas.microsoft.com/office/word/2010/wordprocessingDrawing" xmlns:wp="http://schemas.openxmlformats.org/drawingml/2006/wordprocessingDrawing" xmlns:w10="urn:schemas-microsoft-com:office:word" xmlns:w="http://schemas.openxmlformats.org/wordprocessingml/2006/main" xmlns:w14="http://schemas.microsoft.com/office/word/2010/wordml" xmlns:w15="http://schemas.microsoft.com/office/word/2012/wordml" xmlns:w16cex="http://schemas.microsoft.com/office/word/2018/wordml/cex" xmlns:w16cid="http://schemas.microsoft.com/office/word/2016/wordml/cid" xmlns:w16="http://schemas.microsoft.com/office/word/2018/wordml" xmlns:w16du="http://schemas.microsoft.com/office/word/2023/wordml/word16du" xmlns:w16sdtdh="http://schemas.microsoft.com/office/word/2020/wordml/sdtdatahash" xmlns:w16sdtfl="http://schemas.microsoft.com/office/word/2024/wordml/sdtformatlock" xmlns:w16se="http://schemas.microsoft.com/office/word/2015/wordml/symex" xmlns:wpg="http://schemas.microsoft.com/office/word/2010/wordprocessingGroup" xmlns:wpi="http://schemas.microsoft.com/office/word/2010/wordprocessingInk" xmlns:wne="http://schemas.microsoft.com/office/word/2006/wordml" xmlns:wps="http://schemas.microsoft.com/office/word/2010/wordprocessingShape" mc:Ignorable="w14 w15 w16se w16cid w16 w16cex w16sdtdh w16sdtfl w16du wp14">
   <w:tbl>
     <w:tblPr>
       <w:tblW w:w="10508" w:type="dxa"/>
       <w:tblInd w:w="-277" w:type="dxa"/>
       <w:tblBorders>
-        <w:top w:val="single" w:color="000000" w:sz="4" w:space="0"/>
-        <w:left w:val="single" w:color="000000" w:sz="4" w:space="0"/>
-        <w:bottom w:val="single" w:color="000000" w:sz="4" w:space="0"/>
-        <w:right w:val="single" w:color="000000" w:sz="4" w:space="0"/>
-        <w:insideH w:val="single" w:color="000000" w:sz="4" w:space="0"/>
-        <w:insideV w:val="single" w:color="000000" w:sz="4" w:space="0"/>
+        <w:top w:val="single" w:sz="4" w:space="0" w:color="000000"/>
+        <w:left w:val="single" w:sz="4" w:space="0" w:color="000000"/>
+        <w:bottom w:val="single" w:sz="4" w:space="0" w:color="000000"/>
+        <w:right w:val="single" w:sz="4" w:space="0" w:color="000000"/>
+        <w:insideH w:val="single" w:sz="4" w:space="0" w:color="000000"/>
+        <w:insideV w:val="single" w:sz="4" w:space="0" w:color="000000"/>
       </w:tblBorders>
       <w:tblLayout w:type="fixed"/>
       <w:tblLook w:val="0000" w:firstRow="0" w:lastRow="0" w:firstColumn="0" w:lastColumn="0" w:noHBand="0" w:noVBand="0"/>
@@ -1485,7 +1429,7 @@
           <w:pPr>
             <w:spacing w:after="0"/>
             <w:rPr>
-              <w:rFonts w:ascii="Times New Roman" w:hAnsi="Times New Roman" w:eastAsia="Times New Roman"/>
+              <w:rFonts w:ascii="Times New Roman" w:eastAsia="Times New Roman" w:hAnsi="Times New Roman"/>
             </w:rPr>
           </w:pPr>
           <w:r>
@@ -1564,14 +1508,14 @@
             <w:jc w:val="center"/>
             <w:outlineLvl w:val="3"/>
             <w:rPr>
-              <w:rFonts w:ascii="Times New Roman" w:hAnsi="Times New Roman" w:eastAsia="Times New Roman"/>
+              <w:rFonts w:ascii="Times New Roman" w:eastAsia="Times New Roman" w:hAnsi="Times New Roman"/>
               <w:b/>
               <w:lang w:val="es-MX"/>
             </w:rPr>
           </w:pPr>
           <w:r>
             <w:rPr>
-              <w:rFonts w:ascii="Arial" w:hAnsi="Arial" w:eastAsia="MS Mincho" w:cs="Arial"/>
+              <w:rFonts w:ascii="Arial" w:eastAsia="MS Mincho" w:hAnsi="Arial" w:cs="Arial"/>
               <w:b/>
               <w:lang w:val="es-ES" w:eastAsia="es-ES"/>
             </w:rPr>
@@ -1579,7 +1523,7 @@
           </w:r>
           <w:r>
             <w:rPr>
-              <w:rFonts w:ascii="Arial" w:hAnsi="Arial" w:eastAsia="MS Mincho" w:cs="Arial"/>
+              <w:rFonts w:ascii="Arial" w:eastAsia="MS Mincho" w:hAnsi="Arial" w:cs="Arial"/>
               <w:b/>
               <w:lang w:val="es-ES" w:eastAsia="es-ES"/>
             </w:rPr>
@@ -1587,7 +1531,7 @@
           </w:r>
           <w:r>
             <w:rPr>
-              <w:rFonts w:ascii="Arial" w:hAnsi="Arial" w:eastAsia="MS Mincho" w:cs="Arial"/>
+              <w:rFonts w:ascii="Arial" w:eastAsia="MS Mincho" w:hAnsi="Arial" w:cs="Arial"/>
               <w:b/>
               <w:lang w:val="es-ES" w:eastAsia="es-ES"/>
             </w:rPr>
@@ -1595,7 +1539,7 @@
           </w:r>
           <w:r>
             <w:rPr>
-              <w:rFonts w:ascii="Arial" w:hAnsi="Arial" w:eastAsia="MS Mincho" w:cs="Arial"/>
+              <w:rFonts w:ascii="Arial" w:eastAsia="MS Mincho" w:hAnsi="Arial" w:cs="Arial"/>
               <w:b/>
               <w:lang w:val="es-ES" w:eastAsia="es-ES"/>
             </w:rPr>
@@ -1612,14 +1556,14 @@
           <w:pPr>
             <w:spacing w:after="0"/>
             <w:rPr>
-              <w:rFonts w:ascii="Times New Roman" w:hAnsi="Times New Roman" w:eastAsia="Times New Roman"/>
+              <w:rFonts w:ascii="Times New Roman" w:eastAsia="Times New Roman" w:hAnsi="Times New Roman"/>
               <w:sz w:val="20"/>
               <w:szCs w:val="20"/>
             </w:rPr>
           </w:pPr>
           <w:r>
             <w:rPr>
-              <w:rFonts w:ascii="Times New Roman" w:hAnsi="Times New Roman" w:eastAsia="Times New Roman"/>
+              <w:rFonts w:ascii="Times New Roman" w:eastAsia="Times New Roman" w:hAnsi="Times New Roman"/>
               <w:sz w:val="20"/>
               <w:szCs w:val="20"/>
             </w:rPr>
@@ -1636,14 +1580,14 @@
           <w:pPr>
             <w:spacing w:after="0"/>
             <w:rPr>
-              <w:rFonts w:ascii="Times New Roman" w:hAnsi="Times New Roman" w:eastAsia="Times New Roman"/>
+              <w:rFonts w:ascii="Times New Roman" w:eastAsia="Times New Roman" w:hAnsi="Times New Roman"/>
               <w:sz w:val="20"/>
               <w:szCs w:val="20"/>
             </w:rPr>
           </w:pPr>
           <w:r>
             <w:rPr>
-              <w:rFonts w:ascii="Times New Roman" w:hAnsi="Times New Roman" w:eastAsia="Times New Roman"/>
+              <w:rFonts w:ascii="Times New Roman" w:eastAsia="Times New Roman" w:hAnsi="Times New Roman"/>
               <w:sz w:val="20"/>
               <w:szCs w:val="20"/>
             </w:rPr>
@@ -1673,7 +1617,7 @@
             </w:pBdr>
             <w:spacing w:after="0"/>
             <w:rPr>
-              <w:rFonts w:ascii="Times New Roman" w:hAnsi="Times New Roman" w:eastAsia="Times New Roman"/>
+              <w:rFonts w:ascii="Times New Roman" w:eastAsia="Times New Roman" w:hAnsi="Times New Roman"/>
             </w:rPr>
           </w:pPr>
         </w:p>
@@ -1696,7 +1640,7 @@
             </w:pBdr>
             <w:spacing w:after="0"/>
             <w:rPr>
-              <w:rFonts w:ascii="Times New Roman" w:hAnsi="Times New Roman" w:eastAsia="Times New Roman"/>
+              <w:rFonts w:ascii="Times New Roman" w:eastAsia="Times New Roman" w:hAnsi="Times New Roman"/>
             </w:rPr>
           </w:pPr>
         </w:p>
@@ -1710,14 +1654,14 @@
           <w:pPr>
             <w:spacing w:after="0"/>
             <w:rPr>
-              <w:rFonts w:ascii="Times New Roman" w:hAnsi="Times New Roman" w:eastAsia="Times New Roman"/>
+              <w:rFonts w:ascii="Times New Roman" w:eastAsia="Times New Roman" w:hAnsi="Times New Roman"/>
               <w:sz w:val="20"/>
               <w:szCs w:val="20"/>
             </w:rPr>
           </w:pPr>
           <w:r>
             <w:rPr>
-              <w:rFonts w:ascii="Times New Roman" w:hAnsi="Times New Roman" w:eastAsia="Times New Roman"/>
+              <w:rFonts w:ascii="Times New Roman" w:eastAsia="Times New Roman" w:hAnsi="Times New Roman"/>
               <w:sz w:val="20"/>
               <w:szCs w:val="20"/>
             </w:rPr>
@@ -1734,14 +1678,14 @@
           <w:pPr>
             <w:spacing w:after="0"/>
             <w:rPr>
-              <w:rFonts w:ascii="Times New Roman" w:hAnsi="Times New Roman" w:eastAsia="Times New Roman"/>
+              <w:rFonts w:ascii="Times New Roman" w:eastAsia="Times New Roman" w:hAnsi="Times New Roman"/>
               <w:sz w:val="20"/>
               <w:szCs w:val="20"/>
             </w:rPr>
           </w:pPr>
           <w:r>
             <w:rPr>
-              <w:rFonts w:ascii="Times New Roman" w:hAnsi="Times New Roman" w:eastAsia="Times New Roman"/>
+              <w:rFonts w:ascii="Times New Roman" w:eastAsia="Times New Roman" w:hAnsi="Times New Roman"/>
               <w:sz w:val="20"/>
               <w:szCs w:val="20"/>
             </w:rPr>
@@ -1771,7 +1715,7 @@
             </w:pBdr>
             <w:spacing w:after="0"/>
             <w:rPr>
-              <w:rFonts w:ascii="Times New Roman" w:hAnsi="Times New Roman" w:eastAsia="Times New Roman"/>
+              <w:rFonts w:ascii="Times New Roman" w:eastAsia="Times New Roman" w:hAnsi="Times New Roman"/>
             </w:rPr>
           </w:pPr>
         </w:p>
@@ -1794,7 +1738,7 @@
             </w:pBdr>
             <w:spacing w:after="0"/>
             <w:rPr>
-              <w:rFonts w:ascii="Times New Roman" w:hAnsi="Times New Roman" w:eastAsia="Times New Roman"/>
+              <w:rFonts w:ascii="Times New Roman" w:eastAsia="Times New Roman" w:hAnsi="Times New Roman"/>
             </w:rPr>
           </w:pPr>
         </w:p>
@@ -1808,14 +1752,14 @@
           <w:pPr>
             <w:spacing w:after="0"/>
             <w:rPr>
-              <w:rFonts w:ascii="Times New Roman" w:hAnsi="Times New Roman" w:eastAsia="Times New Roman"/>
+              <w:rFonts w:ascii="Times New Roman" w:eastAsia="Times New Roman" w:hAnsi="Times New Roman"/>
               <w:sz w:val="20"/>
               <w:szCs w:val="20"/>
             </w:rPr>
           </w:pPr>
           <w:r>
             <w:rPr>
-              <w:rFonts w:ascii="Times New Roman" w:hAnsi="Times New Roman" w:eastAsia="Times New Roman"/>
+              <w:rFonts w:ascii="Times New Roman" w:eastAsia="Times New Roman" w:hAnsi="Times New Roman"/>
               <w:sz w:val="20"/>
               <w:szCs w:val="20"/>
             </w:rPr>
@@ -1832,14 +1776,14 @@
           <w:pPr>
             <w:spacing w:after="0"/>
             <w:rPr>
-              <w:rFonts w:ascii="Times New Roman" w:hAnsi="Times New Roman" w:eastAsia="Times New Roman"/>
+              <w:rFonts w:ascii="Times New Roman" w:eastAsia="Times New Roman" w:hAnsi="Times New Roman"/>
               <w:sz w:val="20"/>
               <w:szCs w:val="20"/>
             </w:rPr>
           </w:pPr>
           <w:r>
             <w:rPr>
-              <w:rFonts w:ascii="Times New Roman" w:hAnsi="Times New Roman" w:eastAsia="Times New Roman"/>
+              <w:rFonts w:ascii="Times New Roman" w:eastAsia="Times New Roman" w:hAnsi="Times New Roman"/>
               <w:sz w:val="20"/>
               <w:szCs w:val="20"/>
             </w:rPr>
@@ -1862,7 +1806,7 @@
   <w:docDefaults>
     <w:rPrDefault>
       <w:rPr>
-        <w:rFonts w:asciiTheme="minorHAnsi" w:hAnsiTheme="minorHAnsi" w:eastAsiaTheme="minorHAnsi" w:cstheme="minorBidi"/>
+        <w:rFonts w:asciiTheme="minorHAnsi" w:eastAsiaTheme="minorHAnsi" w:hAnsiTheme="minorHAnsi" w:cstheme="minorBidi"/>
         <w:sz w:val="22"/>
         <w:szCs w:val="22"/>
         <w:lang w:val="es-CO" w:eastAsia="en-US" w:bidi="ar-SA"/>
@@ -1877,14 +1821,14 @@
   <w:latentStyles w:defLockedState="0" w:defUIPriority="99" w:defSemiHidden="0" w:defUnhideWhenUsed="0" w:defQFormat="0" w:count="376">
     <w:lsdException w:name="Normal" w:uiPriority="0" w:qFormat="1"/>
     <w:lsdException w:name="heading 1" w:uiPriority="9" w:qFormat="1"/>
-    <w:lsdException w:name="heading 2" w:uiPriority="9" w:semiHidden="1" w:unhideWhenUsed="1" w:qFormat="1"/>
-    <w:lsdException w:name="heading 3" w:uiPriority="9" w:semiHidden="1" w:unhideWhenUsed="1" w:qFormat="1"/>
-    <w:lsdException w:name="heading 4" w:uiPriority="9" w:semiHidden="1" w:unhideWhenUsed="1" w:qFormat="1"/>
-    <w:lsdException w:name="heading 5" w:uiPriority="9" w:semiHidden="1" w:unhideWhenUsed="1" w:qFormat="1"/>
-    <w:lsdException w:name="heading 6" w:uiPriority="9" w:semiHidden="1" w:unhideWhenUsed="1" w:qFormat="1"/>
-    <w:lsdException w:name="heading 7" w:uiPriority="9" w:semiHidden="1" w:unhideWhenUsed="1" w:qFormat="1"/>
-    <w:lsdException w:name="heading 8" w:uiPriority="9" w:semiHidden="1" w:unhideWhenUsed="1" w:qFormat="1"/>
-    <w:lsdException w:name="heading 9" w:uiPriority="9" w:semiHidden="1" w:unhideWhenUsed="1" w:qFormat="1"/>
+    <w:lsdException w:name="heading 2" w:semiHidden="1" w:uiPriority="9" w:unhideWhenUsed="1" w:qFormat="1"/>
+    <w:lsdException w:name="heading 3" w:semiHidden="1" w:uiPriority="9" w:unhideWhenUsed="1" w:qFormat="1"/>
+    <w:lsdException w:name="heading 4" w:semiHidden="1" w:uiPriority="9" w:unhideWhenUsed="1" w:qFormat="1"/>
+    <w:lsdException w:name="heading 5" w:semiHidden="1" w:uiPriority="9" w:unhideWhenUsed="1" w:qFormat="1"/>
+    <w:lsdException w:name="heading 6" w:semiHidden="1" w:uiPriority="9" w:unhideWhenUsed="1" w:qFormat="1"/>
+    <w:lsdException w:name="heading 7" w:semiHidden="1" w:uiPriority="9" w:unhideWhenUsed="1" w:qFormat="1"/>
+    <w:lsdException w:name="heading 8" w:semiHidden="1" w:uiPriority="9" w:unhideWhenUsed="1" w:qFormat="1"/>
+    <w:lsdException w:name="heading 9" w:semiHidden="1" w:uiPriority="9" w:unhideWhenUsed="1" w:qFormat="1"/>
     <w:lsdException w:name="index 1" w:semiHidden="1" w:unhideWhenUsed="1"/>
     <w:lsdException w:name="index 2" w:semiHidden="1" w:unhideWhenUsed="1"/>
     <w:lsdException w:name="index 3" w:semiHidden="1" w:unhideWhenUsed="1"/>
@@ -1894,22 +1838,22 @@
     <w:lsdException w:name="index 7" w:semiHidden="1" w:unhideWhenUsed="1"/>
     <w:lsdException w:name="index 8" w:semiHidden="1" w:unhideWhenUsed="1"/>
     <w:lsdException w:name="index 9" w:semiHidden="1" w:unhideWhenUsed="1"/>
-    <w:lsdException w:name="toc 1" w:uiPriority="39" w:semiHidden="1" w:unhideWhenUsed="1"/>
-    <w:lsdException w:name="toc 2" w:uiPriority="39" w:semiHidden="1" w:unhideWhenUsed="1"/>
-    <w:lsdException w:name="toc 3" w:uiPriority="39" w:semiHidden="1" w:unhideWhenUsed="1"/>
-    <w:lsdException w:name="toc 4" w:uiPriority="39" w:semiHidden="1" w:unhideWhenUsed="1"/>
-    <w:lsdException w:name="toc 5" w:uiPriority="39" w:semiHidden="1" w:unhideWhenUsed="1"/>
-    <w:lsdException w:name="toc 6" w:uiPriority="39" w:semiHidden="1" w:unhideWhenUsed="1"/>
-    <w:lsdException w:name="toc 7" w:uiPriority="39" w:semiHidden="1" w:unhideWhenUsed="1"/>
-    <w:lsdException w:name="toc 8" w:uiPriority="39" w:semiHidden="1" w:unhideWhenUsed="1"/>
-    <w:lsdException w:name="toc 9" w:uiPriority="39" w:semiHidden="1" w:unhideWhenUsed="1"/>
+    <w:lsdException w:name="toc 1" w:semiHidden="1" w:uiPriority="39" w:unhideWhenUsed="1"/>
+    <w:lsdException w:name="toc 2" w:semiHidden="1" w:uiPriority="39" w:unhideWhenUsed="1"/>
+    <w:lsdException w:name="toc 3" w:semiHidden="1" w:uiPriority="39" w:unhideWhenUsed="1"/>
+    <w:lsdException w:name="toc 4" w:semiHidden="1" w:uiPriority="39" w:unhideWhenUsed="1"/>
+    <w:lsdException w:name="toc 5" w:semiHidden="1" w:uiPriority="39" w:unhideWhenUsed="1"/>
+    <w:lsdException w:name="toc 6" w:semiHidden="1" w:uiPriority="39" w:unhideWhenUsed="1"/>
+    <w:lsdException w:name="toc 7" w:semiHidden="1" w:uiPriority="39" w:unhideWhenUsed="1"/>
+    <w:lsdException w:name="toc 8" w:semiHidden="1" w:uiPriority="39" w:unhideWhenUsed="1"/>
+    <w:lsdException w:name="toc 9" w:semiHidden="1" w:uiPriority="39" w:unhideWhenUsed="1"/>
     <w:lsdException w:name="Normal Indent" w:semiHidden="1" w:unhideWhenUsed="1"/>
     <w:lsdException w:name="footnote text" w:semiHidden="1" w:unhideWhenUsed="1"/>
     <w:lsdException w:name="annotation text" w:semiHidden="1" w:unhideWhenUsed="1"/>
     <w:lsdException w:name="header" w:semiHidden="1" w:unhideWhenUsed="1"/>
     <w:lsdException w:name="footer" w:semiHidden="1" w:unhideWhenUsed="1"/>
     <w:lsdException w:name="index heading" w:semiHidden="1" w:unhideWhenUsed="1"/>
-    <w:lsdException w:name="caption" w:uiPriority="35" w:semiHidden="1" w:unhideWhenUsed="1" w:qFormat="1"/>
+    <w:lsdException w:name="caption" w:semiHidden="1" w:uiPriority="35" w:unhideWhenUsed="1" w:qFormat="1"/>
     <w:lsdException w:name="table of figures" w:semiHidden="1" w:unhideWhenUsed="1"/>
     <w:lsdException w:name="envelope address" w:semiHidden="1" w:unhideWhenUsed="1"/>
     <w:lsdException w:name="envelope return" w:semiHidden="1" w:unhideWhenUsed="1"/>
@@ -1940,7 +1884,7 @@
     <w:lsdException w:name="Title" w:uiPriority="10" w:qFormat="1"/>
     <w:lsdException w:name="Closing" w:semiHidden="1" w:unhideWhenUsed="1"/>
     <w:lsdException w:name="Signature" w:semiHidden="1" w:unhideWhenUsed="1"/>
-    <w:lsdException w:name="Default Paragraph Font" w:uiPriority="1" w:semiHidden="1" w:unhideWhenUsed="1"/>
+    <w:lsdException w:name="Default Paragraph Font" w:semiHidden="1" w:uiPriority="1" w:unhideWhenUsed="1"/>
     <w:lsdException w:name="Body Text" w:semiHidden="1" w:unhideWhenUsed="1"/>
     <w:lsdException w:name="Body Text Indent" w:semiHidden="1" w:unhideWhenUsed="1"/>
     <w:lsdException w:name="List Continue" w:semiHidden="1" w:unhideWhenUsed="1"/>
@@ -2140,8 +2084,8 @@
     <w:lsdException w:name="Subtle Reference" w:uiPriority="31" w:qFormat="1"/>
     <w:lsdException w:name="Intense Reference" w:uiPriority="32" w:qFormat="1"/>
     <w:lsdException w:name="Book Title" w:uiPriority="33" w:qFormat="1"/>
-    <w:lsdException w:name="Bibliography" w:uiPriority="37" w:semiHidden="1" w:unhideWhenUsed="1"/>
-    <w:lsdException w:name="TOC Heading" w:uiPriority="39" w:semiHidden="1" w:unhideWhenUsed="1" w:qFormat="1"/>
+    <w:lsdException w:name="Bibliography" w:semiHidden="1" w:uiPriority="37" w:unhideWhenUsed="1"/>
+    <w:lsdException w:name="TOC Heading" w:semiHidden="1" w:uiPriority="39" w:unhideWhenUsed="1" w:qFormat="1"/>
     <w:lsdException w:name="Plain Table 1" w:uiPriority="41"/>
     <w:lsdException w:name="Plain Table 2" w:uiPriority="42"/>
     <w:lsdException w:name="Plain Table 3" w:uiPriority="43"/>
@@ -2252,7 +2196,7 @@
     <w:lsdException w:name="Unresolved Mention" w:semiHidden="1" w:unhideWhenUsed="1"/>
     <w:lsdException w:name="Smart Link" w:semiHidden="1" w:unhideWhenUsed="1"/>
   </w:latentStyles>
-  <w:style w:type="paragraph" w:styleId="Normal" w:default="1">
+  <w:style w:type="paragraph" w:default="1" w:styleId="Normal">
     <w:name w:val="Normal"/>
     <w:qFormat/>
     <w:rsid w:val="00CB66B0"/>
@@ -2260,16 +2204,16 @@
       <w:spacing w:after="200" w:line="276" w:lineRule="auto"/>
     </w:pPr>
     <w:rPr>
-      <w:rFonts w:ascii="Calibri" w:hAnsi="Calibri" w:eastAsia="Calibri" w:cs="Times New Roman"/>
+      <w:rFonts w:ascii="Calibri" w:eastAsia="Calibri" w:hAnsi="Calibri" w:cs="Times New Roman"/>
     </w:rPr>
   </w:style>
-  <w:style w:type="character" w:styleId="Fuentedeprrafopredeter" w:default="1">
+  <w:style w:type="character" w:default="1" w:styleId="Fuentedeprrafopredeter">
     <w:name w:val="Default Paragraph Font"/>
     <w:uiPriority w:val="1"/>
     <w:semiHidden/>
     <w:unhideWhenUsed/>
   </w:style>
-  <w:style w:type="table" w:styleId="Tablanormal" w:default="1">
+  <w:style w:type="table" w:default="1" w:styleId="Tablanormal">
     <w:name w:val="Normal Table"/>
     <w:uiPriority w:val="99"/>
     <w:semiHidden/>
@@ -2284,7 +2228,7 @@
       </w:tblCellMar>
     </w:tblPr>
   </w:style>
-  <w:style w:type="numbering" w:styleId="Sinlista" w:default="1">
+  <w:style w:type="numbering" w:default="1" w:styleId="Sinlista">
     <w:name w:val="No List"/>
     <w:uiPriority w:val="99"/>
     <w:semiHidden/>
@@ -2302,7 +2246,7 @@
       <w:contextualSpacing/>
     </w:pPr>
     <w:rPr>
-      <w:rFonts w:ascii="Times New Roman" w:hAnsi="Times New Roman" w:eastAsia="Times New Roman"/>
+      <w:rFonts w:ascii="Times New Roman" w:eastAsia="Times New Roman" w:hAnsi="Times New Roman"/>
       <w:sz w:val="24"/>
       <w:szCs w:val="24"/>
       <w:lang w:eastAsia="es-CO"/>
@@ -2331,14 +2275,14 @@
       <w:szCs w:val="20"/>
     </w:rPr>
   </w:style>
-  <w:style w:type="character" w:styleId="TextocomentarioCar" w:customStyle="1">
+  <w:style w:type="character" w:customStyle="1" w:styleId="TextocomentarioCar">
     <w:name w:val="Texto comentario Car"/>
     <w:basedOn w:val="Fuentedeprrafopredeter"/>
     <w:link w:val="Textocomentario"/>
     <w:uiPriority w:val="99"/>
     <w:rsid w:val="008E3595"/>
     <w:rPr>
-      <w:rFonts w:ascii="Calibri" w:hAnsi="Calibri" w:eastAsia="Calibri" w:cs="Times New Roman"/>
+      <w:rFonts w:ascii="Calibri" w:eastAsia="Calibri" w:hAnsi="Calibri" w:cs="Times New Roman"/>
       <w:sz w:val="20"/>
       <w:szCs w:val="20"/>
     </w:rPr>
@@ -2360,7 +2304,7 @@
       <w:szCs w:val="18"/>
     </w:rPr>
   </w:style>
-  <w:style w:type="character" w:styleId="TextodegloboCar" w:customStyle="1">
+  <w:style w:type="character" w:customStyle="1" w:styleId="TextodegloboCar">
     <w:name w:val="Texto de globo Car"/>
     <w:basedOn w:val="Fuentedeprrafopredeter"/>
     <w:link w:val="Textodeglobo"/>
@@ -2368,7 +2312,7 @@
     <w:semiHidden/>
     <w:rsid w:val="008E3595"/>
     <w:rPr>
-      <w:rFonts w:ascii="Segoe UI" w:hAnsi="Segoe UI" w:eastAsia="Calibri" w:cs="Segoe UI"/>
+      <w:rFonts w:ascii="Segoe UI" w:eastAsia="Calibri" w:hAnsi="Segoe UI" w:cs="Segoe UI"/>
       <w:sz w:val="18"/>
       <w:szCs w:val="18"/>
     </w:rPr>
@@ -2388,14 +2332,14 @@
       <w:spacing w:after="0" w:line="240" w:lineRule="auto"/>
     </w:pPr>
   </w:style>
-  <w:style w:type="character" w:styleId="EncabezadoCar" w:customStyle="1">
+  <w:style w:type="character" w:customStyle="1" w:styleId="EncabezadoCar">
     <w:name w:val="Encabezado Car"/>
     <w:basedOn w:val="Fuentedeprrafopredeter"/>
     <w:link w:val="Encabezado"/>
     <w:uiPriority w:val="99"/>
     <w:rsid w:val="008E3595"/>
     <w:rPr>
-      <w:rFonts w:ascii="Calibri" w:hAnsi="Calibri" w:eastAsia="Calibri" w:cs="Times New Roman"/>
+      <w:rFonts w:ascii="Calibri" w:eastAsia="Calibri" w:hAnsi="Calibri" w:cs="Times New Roman"/>
     </w:rPr>
   </w:style>
   <w:style w:type="paragraph" w:styleId="Piedepgina">
@@ -2413,14 +2357,14 @@
       <w:spacing w:after="0" w:line="240" w:lineRule="auto"/>
     </w:pPr>
   </w:style>
-  <w:style w:type="character" w:styleId="PiedepginaCar" w:customStyle="1">
+  <w:style w:type="character" w:customStyle="1" w:styleId="PiedepginaCar">
     <w:name w:val="Pie de página Car"/>
     <w:basedOn w:val="Fuentedeprrafopredeter"/>
     <w:link w:val="Piedepgina"/>
     <w:uiPriority w:val="99"/>
     <w:rsid w:val="008E3595"/>
     <w:rPr>
-      <w:rFonts w:ascii="Calibri" w:hAnsi="Calibri" w:eastAsia="Calibri" w:cs="Times New Roman"/>
+      <w:rFonts w:ascii="Calibri" w:eastAsia="Calibri" w:hAnsi="Calibri" w:cs="Times New Roman"/>
     </w:rPr>
   </w:style>
   <w:style w:type="paragraph" w:styleId="Asuntodelcomentario">
@@ -2440,7 +2384,7 @@
       <w:bCs/>
     </w:rPr>
   </w:style>
-  <w:style w:type="character" w:styleId="AsuntodelcomentarioCar" w:customStyle="1">
+  <w:style w:type="character" w:customStyle="1" w:styleId="AsuntodelcomentarioCar">
     <w:name w:val="Asunto del comentario Car"/>
     <w:basedOn w:val="TextocomentarioCar"/>
     <w:link w:val="Asuntodelcomentario"/>
@@ -2448,7 +2392,7 @@
     <w:semiHidden/>
     <w:rsid w:val="00577ECE"/>
     <w:rPr>
-      <w:rFonts w:ascii="Calibri" w:hAnsi="Calibri" w:eastAsia="Calibri" w:cs="Times New Roman"/>
+      <w:rFonts w:ascii="Calibri" w:eastAsia="Calibri" w:hAnsi="Calibri" w:cs="Times New Roman"/>
       <w:b/>
       <w:bCs/>
       <w:sz w:val="20"/>
@@ -2465,12 +2409,12 @@
     </w:pPr>
     <w:tblPr>
       <w:tblBorders>
-        <w:top w:val="single" w:color="auto" w:sz="4" w:space="0"/>
-        <w:left w:val="single" w:color="auto" w:sz="4" w:space="0"/>
-        <w:bottom w:val="single" w:color="auto" w:sz="4" w:space="0"/>
-        <w:right w:val="single" w:color="auto" w:sz="4" w:space="0"/>
-        <w:insideH w:val="single" w:color="auto" w:sz="4" w:space="0"/>
-        <w:insideV w:val="single" w:color="auto" w:sz="4" w:space="0"/>
+        <w:top w:val="single" w:sz="4" w:space="0" w:color="auto"/>
+        <w:left w:val="single" w:sz="4" w:space="0" w:color="auto"/>
+        <w:bottom w:val="single" w:sz="4" w:space="0" w:color="auto"/>
+        <w:right w:val="single" w:sz="4" w:space="0" w:color="auto"/>
+        <w:insideH w:val="single" w:sz="4" w:space="0" w:color="auto"/>
+        <w:insideV w:val="single" w:sz="4" w:space="0" w:color="auto"/>
       </w:tblBorders>
     </w:tblPr>
   </w:style>
@@ -2478,7 +2422,7 @@
 </file>
 
 <file path=word/theme/theme1.xml><?xml version="1.0" encoding="utf-8"?>
-<a:theme xmlns:a="http://schemas.openxmlformats.org/drawingml/2006/main" xmlns:thm15="http://schemas.microsoft.com/office/thememl/2012/main" name="Tema de Office">
+<a:theme xmlns:a="http://schemas.openxmlformats.org/drawingml/2006/main" name="Tema de Office">
   <a:themeElements>
     <a:clrScheme name="Office">
       <a:dk1>
@@ -2980,15 +2924,6 @@
 </file>
 
 <file path=customXml/item2.xml><?xml version="1.0" encoding="utf-8"?>
-<?mso-contentType ?>
-<FormTemplates xmlns="http://schemas.microsoft.com/sharepoint/v3/contenttype/forms">
-  <Display>DocumentLibraryForm</Display>
-  <Edit>DocumentLibraryForm</Edit>
-  <New>DocumentLibraryForm</New>
-</FormTemplates>
-</file>
-
-<file path=customXml/item3.xml><?xml version="1.0" encoding="utf-8"?>
 <p:properties xmlns:p="http://schemas.microsoft.com/office/2006/metadata/properties" xmlns:xsi="http://www.w3.org/2001/XMLSchema-instance" xmlns:pc="http://schemas.microsoft.com/office/infopath/2007/PartnerControls">
   <documentManagement>
     <lcf76f155ced4ddcb4097134ff3c332f xmlns="15c23b83-0a74-4dd8-96fd-c1cdb1965e64">
@@ -2999,14 +2934,49 @@
 </p:properties>
 </file>
 
+<file path=customXml/item3.xml><?xml version="1.0" encoding="utf-8"?>
+<?mso-contentType ?>
+<FormTemplates xmlns="http://schemas.microsoft.com/sharepoint/v3/contenttype/forms">
+  <Display>DocumentLibraryForm</Display>
+  <Edit>DocumentLibraryForm</Edit>
+  <New>DocumentLibraryForm</New>
+</FormTemplates>
+</file>
+
 <file path=customXml/itemProps1.xml><?xml version="1.0" encoding="utf-8"?>
-<ds:datastoreItem xmlns:ds="http://schemas.openxmlformats.org/officeDocument/2006/customXml" ds:itemID="{E7A7A32B-2D22-42B1-B9EE-C3E2280599EF}"/>
+<ds:datastoreItem xmlns:ds="http://schemas.openxmlformats.org/officeDocument/2006/customXml" ds:itemID="{E7A7A32B-2D22-42B1-B9EE-C3E2280599EF}">
+  <ds:schemaRefs>
+    <ds:schemaRef ds:uri="http://schemas.microsoft.com/office/2006/metadata/contentType"/>
+    <ds:schemaRef ds:uri="http://schemas.microsoft.com/office/2006/metadata/properties/metaAttributes"/>
+    <ds:schemaRef ds:uri="http://www.w3.org/2001/XMLSchema"/>
+    <ds:schemaRef ds:uri="http://schemas.microsoft.com/office/2006/metadata/properties"/>
+    <ds:schemaRef ds:uri="15c23b83-0a74-4dd8-96fd-c1cdb1965e64"/>
+    <ds:schemaRef ds:uri="a9d0ce2f-9ce2-4b22-8e2a-723aa410c551"/>
+    <ds:schemaRef ds:uri="http://schemas.microsoft.com/office/2006/documentManagement/types"/>
+    <ds:schemaRef ds:uri="http://schemas.microsoft.com/office/infopath/2007/PartnerControls"/>
+    <ds:schemaRef ds:uri="http://schemas.openxmlformats.org/package/2006/metadata/core-properties"/>
+    <ds:schemaRef ds:uri="http://purl.org/dc/elements/1.1/"/>
+    <ds:schemaRef ds:uri="http://purl.org/dc/terms/"/>
+    <ds:schemaRef ds:uri="http://schemas.microsoft.com/internal/obd"/>
+  </ds:schemaRefs>
+</ds:datastoreItem>
 </file>
 
 <file path=customXml/itemProps2.xml><?xml version="1.0" encoding="utf-8"?>
-<ds:datastoreItem xmlns:ds="http://schemas.openxmlformats.org/officeDocument/2006/customXml" ds:itemID="{6E42620F-EA52-46A3-AF92-9188E2FB2822}"/>
+<ds:datastoreItem xmlns:ds="http://schemas.openxmlformats.org/officeDocument/2006/customXml" ds:itemID="{FAEC7C88-3BC7-46FB-A03C-FBCCEAD2F93D}">
+  <ds:schemaRefs>
+    <ds:schemaRef ds:uri="http://schemas.microsoft.com/office/2006/metadata/properties"/>
+    <ds:schemaRef ds:uri="http://schemas.microsoft.com/office/infopath/2007/PartnerControls"/>
+    <ds:schemaRef ds:uri="15c23b83-0a74-4dd8-96fd-c1cdb1965e64"/>
+    <ds:schemaRef ds:uri="a9d0ce2f-9ce2-4b22-8e2a-723aa410c551"/>
+  </ds:schemaRefs>
+</ds:datastoreItem>
 </file>
 
 <file path=customXml/itemProps3.xml><?xml version="1.0" encoding="utf-8"?>
-<ds:datastoreItem xmlns:ds="http://schemas.openxmlformats.org/officeDocument/2006/customXml" ds:itemID="{FAEC7C88-3BC7-46FB-A03C-FBCCEAD2F93D}"/>
+<ds:datastoreItem xmlns:ds="http://schemas.openxmlformats.org/officeDocument/2006/customXml" ds:itemID="{6E42620F-EA52-46A3-AF92-9188E2FB2822}">
+  <ds:schemaRefs>
+    <ds:schemaRef ds:uri="http://schemas.microsoft.com/sharepoint/v3/contenttype/forms"/>
+  </ds:schemaRefs>
+</ds:datastoreItem>
 </file>
</xml_diff>